<commit_message>
working java and c
</commit_message>
<xml_diff>
--- a/Completed_Java_Manual.docx
+++ b/Completed_Java_Manual.docx
@@ -73,7 +73,9 @@
         <w:t xml:space="preserve">        System.out.println(num2);</w:t>
         <w:br/>
         <w:br/>
-        <w:t xml:space="preserve">        System.out.print("Enter an operator (+, -, *, /, %): ");</w:t>
+        <w:t xml:space="preserve">        System.out.println("Select operation (+, -, *, /, %): ");</w:t>
+        <w:br/>
+        <w:t xml:space="preserve">        System.out.print("Enter choice: ");</w:t>
         <w:br/>
         <w:t xml:space="preserve">        char operator = scanner.next().charAt(0);</w:t>
         <w:br/>
@@ -135,7 +137,7 @@
         <w:br/>
         <w:t xml:space="preserve">                } else {</w:t>
         <w:br/>
-        <w:t xml:space="preserve">                    System.out.println("Error: Modulo by zero is not allowed.");</w:t>
+        <w:t xml:space="preserve">                    System.out.println("Error: Modulus by zero is not allowed.");</w:t>
         <w:br/>
         <w:t xml:space="preserve">                }</w:t>
         <w:br/>
@@ -170,7 +172,7 @@
       <w:r>
         <w:drawing>
           <wp:inline xmlns:a="http://schemas.openxmlformats.org/drawingml/2006/main" xmlns:pic="http://schemas.openxmlformats.org/drawingml/2006/picture">
-            <wp:extent cx="5486400" cy="1451786"/>
+            <wp:extent cx="5486400" cy="1637479"/>
             <wp:docPr id="1" name="Picture 1"/>
             <wp:cNvGraphicFramePr>
               <a:graphicFrameLocks noChangeAspect="1"/>
@@ -191,7 +193,7 @@
                   <pic:spPr>
                     <a:xfrm>
                       <a:off x="0" y="0"/>
-                      <a:ext cx="5486400" cy="1451786"/>
+                      <a:ext cx="5486400" cy="1637479"/>
                     </a:xfrm>
                     <a:prstGeom prst="rect"/>
                   </pic:spPr>
@@ -229,86 +231,61 @@
         <w:t>import java.util.Scanner;</w:t>
         <w:br/>
         <w:br/>
-        <w:t>public class Exp1B_FibonacciAndForEach {</w:t>
+        <w:t>public class Exp1B_FibonacciArray {</w:t>
         <w:br/>
         <w:t xml:space="preserve">    public static void main(String[] args) {</w:t>
         <w:br/>
-        <w:t xml:space="preserve">        // Part 1: Display Fibonacci Series using a loop</w:t>
-        <w:br/>
         <w:t xml:space="preserve">        Scanner scanner = new Scanner(System.in);</w:t>
         <w:br/>
+        <w:br/>
         <w:t xml:space="preserve">        System.out.print("Enter the number of terms for Fibonacci series: ");</w:t>
         <w:br/>
-        <w:t xml:space="preserve">        </w:t>
-        <w:br/>
-        <w:t xml:space="preserve">        // In an automated test environment, provide a default if scanner doesn't have input</w:t>
-        <w:br/>
-        <w:t xml:space="preserve">        int n = 10;</w:t>
-        <w:br/>
-        <w:t xml:space="preserve">        if (scanner.hasNextInt()) {</w:t>
-        <w:br/>
-        <w:t xml:space="preserve">            n = scanner.nextInt();</w:t>
+        <w:t xml:space="preserve">        int n = scanner.nextInt();</w:t>
+        <w:br/>
+        <w:t xml:space="preserve">        System.out.println(n);</w:t>
+        <w:br/>
+        <w:br/>
+        <w:t xml:space="preserve">        System.out.println("--- Fibonacci Series using Loop ---");</w:t>
+        <w:br/>
+        <w:t xml:space="preserve">        if (n &lt;= 0) {</w:t>
+        <w:br/>
+        <w:t xml:space="preserve">            System.out.println("Please enter a positive integer.");</w:t>
+        <w:br/>
+        <w:t xml:space="preserve">        } else {</w:t>
+        <w:br/>
+        <w:t xml:space="preserve">            long t1 = 0, t2 = 1;</w:t>
+        <w:br/>
+        <w:t xml:space="preserve">            for (int i = 1; i &lt;= n; ++i) {</w:t>
+        <w:br/>
+        <w:t xml:space="preserve">                System.out.print(t1 + " ");</w:t>
+        <w:br/>
+        <w:t xml:space="preserve">                long sum = t1 + t2;</w:t>
+        <w:br/>
+        <w:t xml:space="preserve">                t1 = t2;</w:t>
+        <w:br/>
+        <w:t xml:space="preserve">                t2 = sum;</w:t>
+        <w:br/>
+        <w:t xml:space="preserve">            }</w:t>
+        <w:br/>
+        <w:t xml:space="preserve">            System.out.println();</w:t>
         <w:br/>
         <w:t xml:space="preserve">        }</w:t>
         <w:br/>
-        <w:t xml:space="preserve">        System.out.println(n);</w:t>
-        <w:br/>
-        <w:br/>
-        <w:t xml:space="preserve">        System.out.println("Fibonacci Series up to " + n + " terms:");</w:t>
-        <w:br/>
-        <w:t xml:space="preserve">        if (n &lt;= 0) {</w:t>
-        <w:br/>
-        <w:t xml:space="preserve">            System.out.println("Please enter a positive integer.");</w:t>
-        <w:br/>
-        <w:t xml:space="preserve">        } else {</w:t>
-        <w:br/>
-        <w:t xml:space="preserve">            long t1 = 0, t2 = 1;</w:t>
-        <w:br/>
-        <w:t xml:space="preserve">            for (int i = 1; i &lt;= n; ++i) {</w:t>
-        <w:br/>
-        <w:t xml:space="preserve">                System.out.print(t1 + " ");</w:t>
-        <w:br/>
-        <w:t xml:space="preserve">                long sum = t1 + t2;</w:t>
-        <w:br/>
-        <w:t xml:space="preserve">                t1 = t2;</w:t>
-        <w:br/>
-        <w:t xml:space="preserve">                t2 = sum;</w:t>
-        <w:br/>
-        <w:t xml:space="preserve">            }</w:t>
-        <w:br/>
-        <w:t xml:space="preserve">            System.out.println();</w:t>
+        <w:br/>
+        <w:t xml:space="preserve">        System.out.println("\n--- Implementing For-Each Loop to Display Array Elements ---");</w:t>
+        <w:br/>
+        <w:t xml:space="preserve">        int[] numbers = {10, 20, 30, 40, 50, 60, 70, 80, 90, 100};</w:t>
+        <w:br/>
+        <w:t xml:space="preserve">        System.out.print("Array elements are: ");</w:t>
+        <w:br/>
+        <w:t xml:space="preserve">        for (int num : numbers) {</w:t>
+        <w:br/>
+        <w:t xml:space="preserve">            System.out.print(num + " ");</w:t>
         <w:br/>
         <w:t xml:space="preserve">        }</w:t>
         <w:br/>
-        <w:br/>
-        <w:t xml:space="preserve">        // Part 2: Implement for-each loop to display array elements</w:t>
-        <w:br/>
-        <w:t xml:space="preserve">        System.out.println("\n--- Array Elements using For-Each Loop ---");</w:t>
-        <w:br/>
-        <w:t xml:space="preserve">        String[] fruits = {"Apple", "Banana", "Cherry", "Date", "Elderberry"};</w:t>
-        <w:br/>
-        <w:t xml:space="preserve">        </w:t>
-        <w:br/>
-        <w:t xml:space="preserve">        System.out.println("Displaying elements of the String array:");</w:t>
-        <w:br/>
-        <w:t xml:space="preserve">        for (String fruit : fruits) {</w:t>
-        <w:br/>
-        <w:t xml:space="preserve">            System.out.println("Fruit: " + fruit);</w:t>
-        <w:br/>
-        <w:t xml:space="preserve">        }</w:t>
-        <w:br/>
-        <w:br/>
-        <w:t xml:space="preserve">        int[] numbers = {10, 20, 30, 40, 50};</w:t>
-        <w:br/>
-        <w:t xml:space="preserve">        System.out.println("\nDisplaying elements of the integer array:");</w:t>
-        <w:br/>
-        <w:t xml:space="preserve">        for (int num : numbers) {</w:t>
-        <w:br/>
-        <w:t xml:space="preserve">            System.out.println("Number: " + num);</w:t>
-        <w:br/>
-        <w:t xml:space="preserve">        }</w:t>
-        <w:br/>
-        <w:t xml:space="preserve">        </w:t>
+        <w:t xml:space="preserve">        System.out.println();</w:t>
+        <w:br/>
         <w:br/>
         <w:t xml:space="preserve">        scanner.close();</w:t>
         <w:br/>
@@ -330,7 +307,7 @@
       <w:r>
         <w:drawing>
           <wp:inline xmlns:a="http://schemas.openxmlformats.org/drawingml/2006/main" xmlns:pic="http://schemas.openxmlformats.org/drawingml/2006/picture">
-            <wp:extent cx="5486400" cy="4051495"/>
+            <wp:extent cx="5486400" cy="1823173"/>
             <wp:docPr id="2" name="Picture 2"/>
             <wp:cNvGraphicFramePr>
               <a:graphicFrameLocks noChangeAspect="1"/>
@@ -351,7 +328,7 @@
                   <pic:spPr>
                     <a:xfrm>
                       <a:off x="0" y="0"/>
-                      <a:ext cx="5486400" cy="4051495"/>
+                      <a:ext cx="5486400" cy="1823173"/>
                     </a:xfrm>
                     <a:prstGeom prst="rect"/>
                   </pic:spPr>
@@ -417,7 +394,7 @@
         <w:t>import java.util.Scanner;</w:t>
         <w:br/>
         <w:br/>
-        <w:t>public class Exp2A_CircleArea {</w:t>
+        <w:t>public class Exp2_AreaOfCircle {</w:t>
         <w:br/>
         <w:t xml:space="preserve">    public static void main(String[] args) {</w:t>
         <w:br/>
@@ -434,8 +411,6 @@
         <w:t xml:space="preserve">        </w:t>
         <w:br/>
         <w:t xml:space="preserve">        double area = Math.PI * radius * radius;</w:t>
-        <w:br/>
-        <w:t xml:space="preserve">        </w:t>
         <w:br/>
         <w:t xml:space="preserve">        System.out.println("Area of the circle: " + area);</w:t>
         <w:br/>
@@ -524,7 +499,7 @@
         <w:t>import java.io.IOException;</w:t>
         <w:br/>
         <w:br/>
-        <w:t>public class Exp2B_PrimeChecker {</w:t>
+        <w:t>public class Exp2B_PrimeCheck {</w:t>
         <w:br/>
         <w:t xml:space="preserve">    public static void main(String[] args) {</w:t>
         <w:br/>
@@ -532,7 +507,7 @@
         <w:br/>
         <w:t xml:space="preserve">        try {</w:t>
         <w:br/>
-        <w:t xml:space="preserve">            System.out.print("Enter a number to check if it is prime: ");</w:t>
+        <w:t xml:space="preserve">            System.out.print("Enter a number: ");</w:t>
         <w:br/>
         <w:t xml:space="preserve">            String input = reader.readLine();</w:t>
         <w:br/>
@@ -540,7 +515,7 @@
         <w:br/>
         <w:t xml:space="preserve">            </w:t>
         <w:br/>
-        <w:t xml:space="preserve">            int num = Integer.parseInt(input);</w:t>
+        <w:t xml:space="preserve">            int num = Integer.parseInt(input.trim());</w:t>
         <w:br/>
         <w:t xml:space="preserve">            boolean isPrime = true;</w:t>
         <w:br/>
@@ -580,11 +555,11 @@
         <w:br/>
         <w:t xml:space="preserve">        } catch (IOException e) {</w:t>
         <w:br/>
-        <w:t xml:space="preserve">            System.out.println("Error reading input.");</w:t>
+        <w:t xml:space="preserve">            e.printStackTrace();</w:t>
         <w:br/>
         <w:t xml:space="preserve">        } catch (NumberFormatException e) {</w:t>
         <w:br/>
-        <w:t xml:space="preserve">            System.out.println("Please enter a valid integer.");</w:t>
+        <w:t xml:space="preserve">            System.out.println("Invalid integer input.");</w:t>
         <w:br/>
         <w:t xml:space="preserve">        }</w:t>
         <w:br/>
@@ -662,13 +637,13 @@
           <w:rFonts w:ascii="Consolas" w:hAnsi="Consolas"/>
           <w:sz w:val="20"/>
         </w:rPr>
-        <w:t>public class Exp2C_CommandLineAddition {</w:t>
+        <w:t>public class Exp2_CommandLineAddition {</w:t>
         <w:br/>
         <w:t xml:space="preserve">    public static void main(String[] args) {</w:t>
         <w:br/>
-        <w:t xml:space="preserve">        int num1 = 15;</w:t>
-        <w:br/>
-        <w:t xml:space="preserve">        int num2 = 25;</w:t>
+        <w:t xml:space="preserve">        int num1 = 10;</w:t>
+        <w:br/>
+        <w:t xml:space="preserve">        int num2 = 20;</w:t>
         <w:br/>
         <w:br/>
         <w:t xml:space="preserve">        if (args.length &gt;= 2) {</w:t>
@@ -681,13 +656,13 @@
         <w:br/>
         <w:t xml:space="preserve">            } catch (NumberFormatException e) {</w:t>
         <w:br/>
-        <w:t xml:space="preserve">                System.out.println("Invalid command line arguments provided. Using default values.");</w:t>
+        <w:t xml:space="preserve">                System.out.println("Invalid command line arguments. Using default values: 10 and 20");</w:t>
         <w:br/>
         <w:t xml:space="preserve">            }</w:t>
         <w:br/>
         <w:t xml:space="preserve">        } else {</w:t>
         <w:br/>
-        <w:t xml:space="preserve">            System.out.println("No arguments provided or insufficient arguments. Using default command line arguments.");</w:t>
+        <w:t xml:space="preserve">            System.out.println("Insufficient command line arguments provided. Using default values: 10 and 20");</w:t>
         <w:br/>
         <w:t xml:space="preserve">        }</w:t>
         <w:br/>
@@ -696,11 +671,10 @@
         <w:br/>
         <w:t xml:space="preserve">        System.out.println("Second Number: " + num2);</w:t>
         <w:br/>
-        <w:t xml:space="preserve">        </w:t>
         <w:br/>
         <w:t xml:space="preserve">        int sum = num1 + num2;</w:t>
         <w:br/>
-        <w:t xml:space="preserve">        System.out.println("The sum of " + num1 + " and " + num2 + " is: " + sum);</w:t>
+        <w:t xml:space="preserve">        System.out.println("The addition of " + num1 + " and " + num2 + " is: " + sum);</w:t>
         <w:br/>
         <w:t xml:space="preserve">    }</w:t>
         <w:br/>
@@ -798,148 +772,225 @@
         <w:t>import java.util.Scanner;</w:t>
         <w:br/>
         <w:br/>
-        <w:t>// Class demonstrating constructor overloading</w:t>
-        <w:br/>
-        <w:t>class Box {</w:t>
-        <w:br/>
-        <w:t xml:space="preserve">    double width, height, depth;</w:t>
-        <w:br/>
-        <w:br/>
-        <w:t xml:space="preserve">    // Constructor used when all dimensions specified</w:t>
-        <w:br/>
-        <w:t xml:space="preserve">    Box(double w, double h, double d) {</w:t>
-        <w:br/>
-        <w:t xml:space="preserve">        width = w;</w:t>
-        <w:br/>
-        <w:t xml:space="preserve">        height = h;</w:t>
-        <w:br/>
-        <w:t xml:space="preserve">        depth = d;</w:t>
+        <w:t>// Class demonstrating Constructor Overloading and Method Overloading</w:t>
+        <w:br/>
+        <w:t>class Shape {</w:t>
+        <w:br/>
+        <w:t xml:space="preserve">    double length;</w:t>
+        <w:br/>
+        <w:t xml:space="preserve">    double width;</w:t>
+        <w:br/>
+        <w:t xml:space="preserve">    double height;</w:t>
+        <w:br/>
+        <w:br/>
+        <w:t xml:space="preserve">    // 1. Default Constructor</w:t>
+        <w:br/>
+        <w:t xml:space="preserve">    Shape() {</w:t>
+        <w:br/>
+        <w:t xml:space="preserve">        this.length = 0;</w:t>
+        <w:br/>
+        <w:t xml:space="preserve">        this.width = 0;</w:t>
+        <w:br/>
+        <w:t xml:space="preserve">        this.height = 0;</w:t>
         <w:br/>
         <w:t xml:space="preserve">    }</w:t>
         <w:br/>
         <w:br/>
-        <w:t xml:space="preserve">    // Constructor used when no dimensions specified</w:t>
-        <w:br/>
-        <w:t xml:space="preserve">    Box() {</w:t>
-        <w:br/>
-        <w:t xml:space="preserve">        width = height = depth = 0;</w:t>
+        <w:t xml:space="preserve">    // 2. Constructor with 1 parameter (Cube)</w:t>
+        <w:br/>
+        <w:t xml:space="preserve">    Shape(double side) {</w:t>
+        <w:br/>
+        <w:t xml:space="preserve">        this.length = side;</w:t>
+        <w:br/>
+        <w:t xml:space="preserve">        this.width = side;</w:t>
+        <w:br/>
+        <w:t xml:space="preserve">        this.height = side;</w:t>
         <w:br/>
         <w:t xml:space="preserve">    }</w:t>
         <w:br/>
         <w:br/>
-        <w:t xml:space="preserve">    // Constructor used when cube is created</w:t>
-        <w:br/>
-        <w:t xml:space="preserve">    Box(double len) {</w:t>
-        <w:br/>
-        <w:t xml:space="preserve">        width = height = depth = len;</w:t>
+        <w:t xml:space="preserve">    // 3. Constructor with 2 parameters (Rectangle/2D)</w:t>
+        <w:br/>
+        <w:t xml:space="preserve">    Shape(double length, double width) {</w:t>
+        <w:br/>
+        <w:t xml:space="preserve">        this.length = length;</w:t>
+        <w:br/>
+        <w:t xml:space="preserve">        this.width = width;</w:t>
+        <w:br/>
+        <w:t xml:space="preserve">        this.height = 0;</w:t>
         <w:br/>
         <w:t xml:space="preserve">    }</w:t>
         <w:br/>
         <w:br/>
+        <w:t xml:space="preserve">    // 4. Constructor with 3 parameters (Cuboid/Box)</w:t>
+        <w:br/>
+        <w:t xml:space="preserve">    Shape(double length, double width, double height) {</w:t>
+        <w:br/>
+        <w:t xml:space="preserve">        this.length = length;</w:t>
+        <w:br/>
+        <w:t xml:space="preserve">        this.width = width;</w:t>
+        <w:br/>
+        <w:t xml:space="preserve">        this.height = height;</w:t>
+        <w:br/>
+        <w:t xml:space="preserve">    }</w:t>
+        <w:br/>
+        <w:br/>
+        <w:t xml:space="preserve">    // Method to calculate volume using constructor-initialized fields</w:t>
+        <w:br/>
         <w:t xml:space="preserve">    double volume() {</w:t>
         <w:br/>
-        <w:t xml:space="preserve">        return width * height * depth;</w:t>
+        <w:t xml:space="preserve">        return this.length * this.width * this.height;</w:t>
         <w:br/>
         <w:t xml:space="preserve">    }</w:t>
         <w:br/>
+        <w:br/>
+        <w:t xml:space="preserve">    // --- Method Overloading Demonstrations ---</w:t>
+        <w:br/>
+        <w:br/>
+        <w:t xml:space="preserve">    // Overloaded method: Area of a circle (1 parameter: double)</w:t>
+        <w:br/>
+        <w:t xml:space="preserve">    double calculateArea(double radius) {</w:t>
+        <w:br/>
+        <w:t xml:space="preserve">        return Math.PI * radius * radius;</w:t>
+        <w:br/>
+        <w:t xml:space="preserve">    }</w:t>
+        <w:br/>
+        <w:br/>
+        <w:t xml:space="preserve">    // Overloaded method: Area of a rectangle (2 parameters: double, double)</w:t>
+        <w:br/>
+        <w:t xml:space="preserve">    double calculateArea(double length, double width) {</w:t>
+        <w:br/>
+        <w:t xml:space="preserve">        return length * width;</w:t>
+        <w:br/>
+        <w:t xml:space="preserve">    }</w:t>
+        <w:br/>
+        <w:br/>
+        <w:t xml:space="preserve">    // Overloaded method: Area of a triangle using Heron's formula (3 parameters: double, double, double)</w:t>
+        <w:br/>
+        <w:t xml:space="preserve">    double calculateArea(double a, double b, double c) {</w:t>
+        <w:br/>
+        <w:t xml:space="preserve">        double s = (a + b + c) / 2.0;</w:t>
+        <w:br/>
+        <w:t xml:space="preserve">        return Math.sqrt(s * (s - a) * (s - b) * (s - c));</w:t>
+        <w:br/>
+        <w:t xml:space="preserve">    }</w:t>
+        <w:br/>
         <w:t>}</w:t>
         <w:br/>
         <w:br/>
-        <w:t>// Class demonstrating method overloading</w:t>
-        <w:br/>
-        <w:t>class MathOperations {</w:t>
-        <w:br/>
-        <w:br/>
-        <w:t xml:space="preserve">    // Method to add two integers</w:t>
-        <w:br/>
-        <w:t xml:space="preserve">    int add(int a, int b) {</w:t>
-        <w:br/>
-        <w:t xml:space="preserve">        return a + b;</w:t>
-        <w:br/>
-        <w:t xml:space="preserve">    }</w:t>
-        <w:br/>
-        <w:br/>
-        <w:t xml:space="preserve">    // Overloaded method to add three integers</w:t>
-        <w:br/>
-        <w:t xml:space="preserve">    int add(int a, int b, int c) {</w:t>
-        <w:br/>
-        <w:t xml:space="preserve">        return a + b + c;</w:t>
-        <w:br/>
-        <w:t xml:space="preserve">    }</w:t>
-        <w:br/>
-        <w:br/>
-        <w:t xml:space="preserve">    // Overloaded method to add two double values</w:t>
-        <w:br/>
-        <w:t xml:space="preserve">    double add(double a, double b) {</w:t>
-        <w:br/>
-        <w:t xml:space="preserve">        return a + b;</w:t>
-        <w:br/>
-        <w:t xml:space="preserve">    }</w:t>
-        <w:br/>
-        <w:t>}</w:t>
-        <w:br/>
-        <w:br/>
-        <w:t>public class Exp3_Overloading {</w:t>
+        <w:t>public class OverloadingDemo {</w:t>
         <w:br/>
         <w:t xml:space="preserve">    public static void main(String[] args) {</w:t>
         <w:br/>
         <w:t xml:space="preserve">        Scanner scanner = new Scanner(System.in);</w:t>
         <w:br/>
         <w:br/>
-        <w:t xml:space="preserve">        System.out.println("--- Constructor Overloading Demonstration ---");</w:t>
-        <w:br/>
-        <w:t xml:space="preserve">        Box box1 = new Box(10, 20, 15);</w:t>
-        <w:br/>
-        <w:t xml:space="preserve">        Box box2 = new Box();</w:t>
-        <w:br/>
-        <w:t xml:space="preserve">        Box box3 = new Box(7);</w:t>
-        <w:br/>
-        <w:br/>
-        <w:t xml:space="preserve">        System.out.println("Volume of box1 (Parameterized): " + box1.volume());</w:t>
-        <w:br/>
-        <w:t xml:space="preserve">        System.out.println("Volume of box2 (Default): " + box2.volume());</w:t>
-        <w:br/>
-        <w:t xml:space="preserve">        System.out.println("Volume of box3 (Cube): " + box3.volume());</w:t>
-        <w:br/>
-        <w:br/>
-        <w:t xml:space="preserve">        System.out.println("\n--- Method Overloading Demonstration ---");</w:t>
-        <w:br/>
-        <w:t xml:space="preserve">        MathOperations mo = new MathOperations();</w:t>
-        <w:br/>
-        <w:br/>
-        <w:t xml:space="preserve">        System.out.print("Enter two integers to add (space separated): ");</w:t>
-        <w:br/>
-        <w:t xml:space="preserve">        int i1 = scanner.nextInt();</w:t>
-        <w:br/>
-        <w:t xml:space="preserve">        int i2 = scanner.nextInt();</w:t>
-        <w:br/>
-        <w:t xml:space="preserve">        System.out.println("Entered: " + i1 + " and " + i2);</w:t>
-        <w:br/>
-        <w:t xml:space="preserve">        System.out.println("Result of add(int, int): " + mo.add(i1, i2));</w:t>
-        <w:br/>
-        <w:br/>
-        <w:t xml:space="preserve">        System.out.print("Enter three integers to add (space separated): ");</w:t>
-        <w:br/>
-        <w:t xml:space="preserve">        int j1 = scanner.nextInt();</w:t>
-        <w:br/>
-        <w:t xml:space="preserve">        int j2 = scanner.nextInt();</w:t>
-        <w:br/>
-        <w:t xml:space="preserve">        int j3 = scanner.nextInt();</w:t>
-        <w:br/>
-        <w:t xml:space="preserve">        System.out.println("Entered: " + j1 + ", " + j2 + " and " + j3);</w:t>
-        <w:br/>
-        <w:t xml:space="preserve">        System.out.println("Result of add(int, int, int): " + mo.add(j1, j2, j3));</w:t>
-        <w:br/>
-        <w:br/>
-        <w:t xml:space="preserve">        System.out.print("Enter two double values to add (space separated): ");</w:t>
-        <w:br/>
-        <w:t xml:space="preserve">        double d1 = scanner.nextDouble();</w:t>
-        <w:br/>
-        <w:t xml:space="preserve">        double d2 = scanner.nextDouble();</w:t>
-        <w:br/>
-        <w:t xml:space="preserve">        System.out.println("Entered: " + d1 + " and " + d2);</w:t>
-        <w:br/>
-        <w:t xml:space="preserve">        System.out.println("Result of add(double, double): " + mo.add(d1, d2));</w:t>
+        <w:t xml:space="preserve">        System.out.println("====================================================");</w:t>
+        <w:br/>
+        <w:t xml:space="preserve">        System.out.println("  EXPERIMENT 3: METHOD AND CONSTRUCTOR OVERLOADING  ");</w:t>
+        <w:br/>
+        <w:t xml:space="preserve">        System.out.println("====================================================\n");</w:t>
+        <w:br/>
+        <w:br/>
+        <w:t xml:space="preserve">        // --- PART 1: CONSTRUCTOR OVERLOADING ---</w:t>
+        <w:br/>
+        <w:t xml:space="preserve">        System.out.println("--- Demonstrating Constructor Overloading ---");</w:t>
+        <w:br/>
+        <w:br/>
+        <w:t xml:space="preserve">        // Default Constructor</w:t>
+        <w:br/>
+        <w:t xml:space="preserve">        Shape defaultShape = new Shape();</w:t>
+        <w:br/>
+        <w:t xml:space="preserve">        System.out.println("1. Default Constructor created: Volume = " + defaultShape.volume());</w:t>
+        <w:br/>
+        <w:br/>
+        <w:t xml:space="preserve">        // Single-parameter Constructor (Cube)</w:t>
+        <w:br/>
+        <w:t xml:space="preserve">        System.out.print("Enter side of a Cube: ");</w:t>
+        <w:br/>
+        <w:t xml:space="preserve">        double side = scanner.nextDouble();</w:t>
+        <w:br/>
+        <w:t xml:space="preserve">        System.out.println(side);</w:t>
+        <w:br/>
+        <w:t xml:space="preserve">        Shape cube = new Shape(side);</w:t>
+        <w:br/>
+        <w:t xml:space="preserve">        System.out.println("2. Single-parameter Constructor (Cube side = " + side + "): Volume = " + cube.volume());</w:t>
+        <w:br/>
+        <w:br/>
+        <w:t xml:space="preserve">        // Three-parameter Constructor (Cuboid)</w:t>
+        <w:br/>
+        <w:t xml:space="preserve">        System.out.print("Enter length, width, and height of a Cuboid: ");</w:t>
+        <w:br/>
+        <w:t xml:space="preserve">        double l = scanner.nextDouble();</w:t>
+        <w:br/>
+        <w:t xml:space="preserve">        double w = scanner.nextDouble();</w:t>
+        <w:br/>
+        <w:t xml:space="preserve">        double h = scanner.nextDouble();</w:t>
+        <w:br/>
+        <w:t xml:space="preserve">        System.out.println(l + " " + w + " " + h);</w:t>
+        <w:br/>
+        <w:t xml:space="preserve">        Shape cuboid = new Shape(l, w, h);</w:t>
+        <w:br/>
+        <w:t xml:space="preserve">        System.out.println("3. Three-parameter Constructor (Cuboid " + l + " x " + w + " x " + h + "): Volume = " + cuboid.volume());</w:t>
+        <w:br/>
+        <w:br/>
+        <w:t xml:space="preserve">        // --- PART 2: METHOD OVERLOADING ---</w:t>
+        <w:br/>
+        <w:t xml:space="preserve">        System.out.println("\n--- Demonstrating Method Overloading ---");</w:t>
+        <w:br/>
+        <w:t xml:space="preserve">        Shape calculator = new Shape();</w:t>
+        <w:br/>
+        <w:br/>
+        <w:t xml:space="preserve">        // 1. Circle Area</w:t>
+        <w:br/>
+        <w:t xml:space="preserve">        System.out.print("Enter radius of a Circle: ");</w:t>
+        <w:br/>
+        <w:t xml:space="preserve">        double radius = scanner.nextDouble();</w:t>
+        <w:br/>
+        <w:t xml:space="preserve">        System.out.println(radius);</w:t>
+        <w:br/>
+        <w:t xml:space="preserve">        double circleArea = calculator.calculateArea(radius);</w:t>
+        <w:br/>
+        <w:t xml:space="preserve">        System.out.printf("1. calculateArea(radius = %.2f) [Circle] = %.4f\n", radius, circleArea);</w:t>
+        <w:br/>
+        <w:br/>
+        <w:t xml:space="preserve">        // 2. Rectangle Area</w:t>
+        <w:br/>
+        <w:t xml:space="preserve">        System.out.print("Enter length and width of a Rectangle: ");</w:t>
+        <w:br/>
+        <w:t xml:space="preserve">        double rLen = scanner.nextDouble();</w:t>
+        <w:br/>
+        <w:t xml:space="preserve">        double rWid = scanner.nextDouble();</w:t>
+        <w:br/>
+        <w:t xml:space="preserve">        System.out.println(rLen + " " + rWid);</w:t>
+        <w:br/>
+        <w:t xml:space="preserve">        double rectArea = calculator.calculateArea(rLen, rWid);</w:t>
+        <w:br/>
+        <w:t xml:space="preserve">        System.out.printf("2. calculateArea(length = %.2f, width = %.2f) [Rectangle] = %.4f\n", rLen, rWid, rectArea);</w:t>
+        <w:br/>
+        <w:br/>
+        <w:t xml:space="preserve">        // 3. Triangle Area</w:t>
+        <w:br/>
+        <w:t xml:space="preserve">        System.out.print("Enter 3 sides of a Triangle: ");</w:t>
+        <w:br/>
+        <w:t xml:space="preserve">        double s1 = scanner.nextDouble();</w:t>
+        <w:br/>
+        <w:t xml:space="preserve">        double s2 = scanner.nextDouble();</w:t>
+        <w:br/>
+        <w:t xml:space="preserve">        double s3 = scanner.nextDouble();</w:t>
+        <w:br/>
+        <w:t xml:space="preserve">        System.out.println(s1 + " " + s2 + " " + s3);</w:t>
+        <w:br/>
+        <w:t xml:space="preserve">        double triArea = calculator.calculateArea(s1, s2, s3);</w:t>
+        <w:br/>
+        <w:t xml:space="preserve">        System.out.printf("3. calculateArea(a = %.2f, b = %.2f, c = %.2f) [Triangle] = %.4f\n", s1, s2, s3, triArea);</w:t>
+        <w:br/>
+        <w:br/>
+        <w:t xml:space="preserve">        System.out.println("\n====================================================");</w:t>
+        <w:br/>
+        <w:t xml:space="preserve">        System.out.println("   Overloading Demonstration Completed Successfully ");</w:t>
+        <w:br/>
+        <w:t xml:space="preserve">        System.out.println("====================================================");</w:t>
         <w:br/>
         <w:br/>
         <w:t xml:space="preserve">        scanner.close();</w:t>
@@ -962,7 +1013,7 @@
       <w:r>
         <w:drawing>
           <wp:inline xmlns:a="http://schemas.openxmlformats.org/drawingml/2006/main" xmlns:pic="http://schemas.openxmlformats.org/drawingml/2006/picture">
-            <wp:extent cx="5486400" cy="2849653"/>
+            <wp:extent cx="5486400" cy="4589507"/>
             <wp:docPr id="6" name="Picture 6"/>
             <wp:cNvGraphicFramePr>
               <a:graphicFrameLocks noChangeAspect="1"/>
@@ -983,7 +1034,7 @@
                   <pic:spPr>
                     <a:xfrm>
                       <a:off x="0" y="0"/>
-                      <a:ext cx="5486400" cy="2849653"/>
+                      <a:ext cx="5486400" cy="4589507"/>
                     </a:xfrm>
                     <a:prstGeom prst="rect"/>
                   </pic:spPr>
@@ -1019,7 +1070,7 @@
         <w:t xml:space="preserve">Aim: </w:t>
       </w:r>
       <w:r>
-        <w:t>A. Write a program to perform addition of two matrices using 2D array. B. Write a program to implement different String Manipulation functions.</w:t>
+        <w:t>Perform addition of matrices and String Manipulation functions.</w:t>
       </w:r>
     </w:p>
     <w:p>
@@ -1049,13 +1100,12 @@
         <w:t>import java.util.Scanner;</w:t>
         <w:br/>
         <w:br/>
-        <w:t>public class Exp4A_MatrixAddition {</w:t>
+        <w:t>public class Exp4_MatrixAddition {</w:t>
         <w:br/>
         <w:t xml:space="preserve">    public static void main(String[] args) {</w:t>
         <w:br/>
         <w:t xml:space="preserve">        Scanner scanner = new Scanner(System.in);</w:t>
         <w:br/>
-        <w:t xml:space="preserve">        </w:t>
         <w:br/>
         <w:t xml:space="preserve">        System.out.print("Enter number of rows: ");</w:t>
         <w:br/>
@@ -1063,7 +1113,6 @@
         <w:br/>
         <w:t xml:space="preserve">        System.out.println(rows);</w:t>
         <w:br/>
-        <w:t xml:space="preserve">        </w:t>
         <w:br/>
         <w:t xml:space="preserve">        System.out.print("Enter number of columns: ");</w:t>
         <w:br/>
@@ -1071,15 +1120,13 @@
         <w:br/>
         <w:t xml:space="preserve">        System.out.println(cols);</w:t>
         <w:br/>
-        <w:t xml:space="preserve">        </w:t>
-        <w:br/>
-        <w:t xml:space="preserve">        int[][] matrix1 = new int[rows][cols];</w:t>
-        <w:br/>
-        <w:t xml:space="preserve">        int[][] matrix2 = new int[rows][cols];</w:t>
-        <w:br/>
-        <w:t xml:space="preserve">        int[][] sumMatrix = new int[rows][cols];</w:t>
-        <w:br/>
-        <w:t xml:space="preserve">        </w:t>
+        <w:br/>
+        <w:t xml:space="preserve">        int[][] mat1 = new int[rows][cols];</w:t>
+        <w:br/>
+        <w:t xml:space="preserve">        int[][] mat2 = new int[rows][cols];</w:t>
+        <w:br/>
+        <w:t xml:space="preserve">        int[][] sum = new int[rows][cols];</w:t>
+        <w:br/>
         <w:br/>
         <w:t xml:space="preserve">        System.out.println("Enter elements of first matrix:");</w:t>
         <w:br/>
@@ -1089,15 +1136,14 @@
         <w:br/>
         <w:t xml:space="preserve">                System.out.print("Element [" + i + "][" + j + "]: ");</w:t>
         <w:br/>
-        <w:t xml:space="preserve">                matrix1[i][j] = scanner.nextInt();</w:t>
-        <w:br/>
-        <w:t xml:space="preserve">                System.out.println(matrix1[i][j]);</w:t>
+        <w:t xml:space="preserve">                mat1[i][j] = scanner.nextInt();</w:t>
+        <w:br/>
+        <w:t xml:space="preserve">                System.out.println(mat1[i][j]);</w:t>
         <w:br/>
         <w:t xml:space="preserve">            }</w:t>
         <w:br/>
         <w:t xml:space="preserve">        }</w:t>
         <w:br/>
-        <w:t xml:space="preserve">        </w:t>
         <w:br/>
         <w:t xml:space="preserve">        System.out.println("Enter elements of second matrix:");</w:t>
         <w:br/>
@@ -1107,29 +1153,25 @@
         <w:br/>
         <w:t xml:space="preserve">                System.out.print("Element [" + i + "][" + j + "]: ");</w:t>
         <w:br/>
-        <w:t xml:space="preserve">                matrix2[i][j] = scanner.nextInt();</w:t>
-        <w:br/>
-        <w:t xml:space="preserve">                System.out.println(matrix2[i][j]);</w:t>
+        <w:t xml:space="preserve">                mat2[i][j] = scanner.nextInt();</w:t>
+        <w:br/>
+        <w:t xml:space="preserve">                System.out.println(mat2[i][j]);</w:t>
         <w:br/>
         <w:t xml:space="preserve">            }</w:t>
         <w:br/>
         <w:t xml:space="preserve">        }</w:t>
         <w:br/>
-        <w:t xml:space="preserve">        </w:t>
-        <w:br/>
-        <w:t xml:space="preserve">        // Adding the matrices</w:t>
         <w:br/>
         <w:t xml:space="preserve">        for (int i = 0; i &lt; rows; i++) {</w:t>
         <w:br/>
         <w:t xml:space="preserve">            for (int j = 0; j &lt; cols; j++) {</w:t>
         <w:br/>
-        <w:t xml:space="preserve">                sumMatrix[i][j] = matrix1[i][j] + matrix2[i][j];</w:t>
+        <w:t xml:space="preserve">                sum[i][j] = mat1[i][j] + mat2[i][j];</w:t>
         <w:br/>
         <w:t xml:space="preserve">            }</w:t>
         <w:br/>
         <w:t xml:space="preserve">        }</w:t>
         <w:br/>
-        <w:t xml:space="preserve">        </w:t>
         <w:br/>
         <w:t xml:space="preserve">        System.out.println("Sum of the two matrices:");</w:t>
         <w:br/>
@@ -1137,7 +1179,7 @@
         <w:br/>
         <w:t xml:space="preserve">            for (int j = 0; j &lt; cols; j++) {</w:t>
         <w:br/>
-        <w:t xml:space="preserve">                System.out.print(sumMatrix[i][j] + " ");</w:t>
+        <w:t xml:space="preserve">                System.out.print(sum[i][j] + " ");</w:t>
         <w:br/>
         <w:t xml:space="preserve">            }</w:t>
         <w:br/>
@@ -1145,7 +1187,6 @@
         <w:br/>
         <w:t xml:space="preserve">        }</w:t>
         <w:br/>
-        <w:t xml:space="preserve">        </w:t>
         <w:br/>
         <w:t xml:space="preserve">        scanner.close();</w:t>
         <w:br/>
@@ -1226,54 +1267,123 @@
         <w:t>import java.util.Scanner;</w:t>
         <w:br/>
         <w:br/>
-        <w:t>public class Exp4B_StringManipulation {</w:t>
+        <w:t>public class Exp4_StringManipulation {</w:t>
         <w:br/>
         <w:t xml:space="preserve">    public static void main(String[] args) {</w:t>
         <w:br/>
-        <w:t xml:space="preserve">        System.out.println("=== String Manipulation Demo ===");</w:t>
-        <w:br/>
         <w:t xml:space="preserve">        Scanner scanner = new Scanner(System.in);</w:t>
         <w:br/>
-        <w:br/>
-        <w:t xml:space="preserve">        System.out.print("Enter a string: ");</w:t>
-        <w:br/>
-        <w:t xml:space="preserve">        String inputStr = scanner.nextLine();</w:t>
-        <w:br/>
-        <w:t xml:space="preserve">        System.out.println(inputStr);</w:t>
-        <w:br/>
-        <w:br/>
-        <w:t xml:space="preserve">        System.out.print("Enter another string to concatenate: ");</w:t>
-        <w:br/>
-        <w:t xml:space="preserve">        String concatStr = scanner.nextLine();</w:t>
-        <w:br/>
-        <w:t xml:space="preserve">        System.out.println(concatStr);</w:t>
-        <w:br/>
-        <w:br/>
-        <w:t xml:space="preserve">        System.out.println("\n--- Results ---");</w:t>
-        <w:br/>
-        <w:t xml:space="preserve">        System.out.println("1. Length of input string: " + inputStr.length());</w:t>
-        <w:br/>
-        <w:t xml:space="preserve">        System.out.println("2. Uppercase: " + inputStr.toUpperCase());</w:t>
-        <w:br/>
-        <w:t xml:space="preserve">        System.out.println("3. Lowercase: " + inputStr.toLowerCase());</w:t>
-        <w:br/>
-        <w:t xml:space="preserve">        System.out.println("4. Concatenation: " + inputStr.concat(concatStr));</w:t>
-        <w:br/>
         <w:t xml:space="preserve">        </w:t>
         <w:br/>
-        <w:t xml:space="preserve">        if (inputStr.length() &gt; 0) {</w:t>
-        <w:br/>
-        <w:t xml:space="preserve">            System.out.println("5. Character at index 0: " + inputStr.charAt(0));</w:t>
-        <w:br/>
-        <w:t xml:space="preserve">            System.out.println("6. Substring (from index 0, min(3, length)): " + inputStr.substring(0, Math.min(3, inputStr.length())));</w:t>
+        <w:t xml:space="preserve">        System.out.print("Enter the first string: ");</w:t>
+        <w:br/>
+        <w:t xml:space="preserve">        String str1 = scanner.nextLine();</w:t>
+        <w:br/>
+        <w:t xml:space="preserve">        System.out.println(str1);</w:t>
+        <w:br/>
+        <w:t xml:space="preserve">        </w:t>
+        <w:br/>
+        <w:t xml:space="preserve">        System.out.print("Enter the second string: ");</w:t>
+        <w:br/>
+        <w:t xml:space="preserve">        String str2 = scanner.nextLine();</w:t>
+        <w:br/>
+        <w:t xml:space="preserve">        System.out.println(str2);</w:t>
+        <w:br/>
+        <w:t xml:space="preserve">        </w:t>
+        <w:br/>
+        <w:t xml:space="preserve">        System.out.println("\n--- String Manipulation Results ---");</w:t>
+        <w:br/>
+        <w:t xml:space="preserve">        </w:t>
+        <w:br/>
+        <w:t xml:space="preserve">        // 1. Length of strings</w:t>
+        <w:br/>
+        <w:t xml:space="preserve">        System.out.println("Length of String 1: " + str1.length());</w:t>
+        <w:br/>
+        <w:t xml:space="preserve">        System.out.println("Length of String 2: " + str2.length());</w:t>
+        <w:br/>
+        <w:t xml:space="preserve">        </w:t>
+        <w:br/>
+        <w:t xml:space="preserve">        // 2. Concatenation</w:t>
+        <w:br/>
+        <w:t xml:space="preserve">        String concatStr = str1.concat(str2);</w:t>
+        <w:br/>
+        <w:t xml:space="preserve">        System.out.println("Concatenated String: " + concatStr);</w:t>
+        <w:br/>
+        <w:t xml:space="preserve">        </w:t>
+        <w:br/>
+        <w:t xml:space="preserve">        // 3. Uppercase and Lowercase</w:t>
+        <w:br/>
+        <w:t xml:space="preserve">        System.out.println("String 1 in Uppercase: " + str1.toUpperCase());</w:t>
+        <w:br/>
+        <w:t xml:space="preserve">        System.out.println("String 2 in Lowercase: " + str2.toLowerCase());</w:t>
+        <w:br/>
+        <w:t xml:space="preserve">        </w:t>
+        <w:br/>
+        <w:t xml:space="preserve">        // 4. Comparison</w:t>
+        <w:br/>
+        <w:t xml:space="preserve">        System.out.println("Are strings equal? " + str1.equals(str2));</w:t>
+        <w:br/>
+        <w:t xml:space="preserve">        System.out.println("Are strings equal (ignoring case)? " + str1.equalsIgnoreCase(str2));</w:t>
+        <w:br/>
+        <w:t xml:space="preserve">        System.out.println("Lexicographical comparison result: " + str1.compareTo(str2));</w:t>
+        <w:br/>
+        <w:t xml:space="preserve">        </w:t>
+        <w:br/>
+        <w:t xml:space="preserve">        // 5. Substring</w:t>
+        <w:br/>
+        <w:t xml:space="preserve">        if (str1.length() &gt; 0) {</w:t>
+        <w:br/>
+        <w:t xml:space="preserve">            int mid = str1.length() / 2;</w:t>
+        <w:br/>
+        <w:t xml:space="preserve">            System.out.println("Substring of String 1 from index 0 to " + mid + ": " + str1.substring(0, mid));</w:t>
+        <w:br/>
+        <w:t xml:space="preserve">        } else {</w:t>
+        <w:br/>
+        <w:t xml:space="preserve">            System.out.println("String 1 is empty, cannot substring.");</w:t>
         <w:br/>
         <w:t xml:space="preserve">        }</w:t>
         <w:br/>
         <w:t xml:space="preserve">        </w:t>
         <w:br/>
-        <w:t xml:space="preserve">        System.out.println("7. Equals 'Hello': " + inputStr.equals("Hello"));</w:t>
-        <w:br/>
-        <w:t xml:space="preserve">        System.out.println("8. EqualsIgnoreCase 'Hello': " + inputStr.equalsIgnoreCase("Hello"));</w:t>
+        <w:t xml:space="preserve">        // 6. Character Extraction</w:t>
+        <w:br/>
+        <w:t xml:space="preserve">        if (str1.length() &gt; 0) {</w:t>
+        <w:br/>
+        <w:t xml:space="preserve">            System.out.println("Character at index 0 of String 1: " + str1.charAt(0));</w:t>
+        <w:br/>
+        <w:t xml:space="preserve">        }</w:t>
+        <w:br/>
+        <w:t xml:space="preserve">        </w:t>
+        <w:br/>
+        <w:t xml:space="preserve">        // 7. Searching</w:t>
+        <w:br/>
+        <w:t xml:space="preserve">        System.out.print("Enter a character or substring to search in String 1: ");</w:t>
+        <w:br/>
+        <w:t xml:space="preserve">        String searchStr = scanner.nextLine();</w:t>
+        <w:br/>
+        <w:t xml:space="preserve">        System.out.println(searchStr);</w:t>
+        <w:br/>
+        <w:t xml:space="preserve">        System.out.println("Index of search term in String 1: " + str1.indexOf(searchStr));</w:t>
+        <w:br/>
+        <w:t xml:space="preserve">        </w:t>
+        <w:br/>
+        <w:t xml:space="preserve">        // 8. Replacement</w:t>
+        <w:br/>
+        <w:t xml:space="preserve">        if (!str1.isEmpty() &amp;&amp; !searchStr.isEmpty()) {</w:t>
+        <w:br/>
+        <w:t xml:space="preserve">            System.out.println("String 1 after replacing '" + searchStr + "' with '" + str2 + "': " + str1.replace(searchStr, str2));</w:t>
+        <w:br/>
+        <w:t xml:space="preserve">        }</w:t>
+        <w:br/>
+        <w:t xml:space="preserve">        </w:t>
+        <w:br/>
+        <w:t xml:space="preserve">        // 9. Trim (Simulated with padding)</w:t>
+        <w:br/>
+        <w:t xml:space="preserve">        String padded = "   " + str1 + "   ";</w:t>
+        <w:br/>
+        <w:t xml:space="preserve">        System.out.println("Padded string: '" + padded + "'");</w:t>
+        <w:br/>
+        <w:t xml:space="preserve">        System.out.println("Trimmed string: '" + padded.trim() + "'");</w:t>
         <w:br/>
         <w:t xml:space="preserve">        </w:t>
         <w:br/>
@@ -1297,7 +1407,7 @@
       <w:r>
         <w:drawing>
           <wp:inline xmlns:a="http://schemas.openxmlformats.org/drawingml/2006/main" xmlns:pic="http://schemas.openxmlformats.org/drawingml/2006/picture">
-            <wp:extent cx="5486400" cy="3123028"/>
+            <wp:extent cx="5486400" cy="3140448"/>
             <wp:docPr id="8" name="Picture 8"/>
             <wp:cNvGraphicFramePr>
               <a:graphicFrameLocks noChangeAspect="1"/>
@@ -1318,7 +1428,7 @@
                   <pic:spPr>
                     <a:xfrm>
                       <a:off x="0" y="0"/>
-                      <a:ext cx="5486400" cy="3123028"/>
+                      <a:ext cx="5486400" cy="3140448"/>
                     </a:xfrm>
                     <a:prstGeom prst="rect"/>
                   </pic:spPr>
@@ -1381,52 +1491,79 @@
           <w:rFonts w:ascii="Consolas" w:hAnsi="Consolas"/>
           <w:sz w:val="20"/>
         </w:rPr>
+        <w:t>import java.util.Scanner;</w:t>
+        <w:br/>
+        <w:br/>
+        <w:t>// Base class</w:t>
+        <w:br/>
+        <w:t>class Animal {</w:t>
+        <w:br/>
+        <w:t xml:space="preserve">    void eat() {</w:t>
+        <w:br/>
+        <w:t xml:space="preserve">        System.out.println("This animal eats food.");</w:t>
+        <w:br/>
+        <w:t xml:space="preserve">    }</w:t>
+        <w:br/>
+        <w:t>}</w:t>
+        <w:br/>
+        <w:br/>
+        <w:t>// Derived class 1 (Inherits Animal)</w:t>
+        <w:br/>
+        <w:t>class Mammal extends Animal {</w:t>
+        <w:br/>
+        <w:t xml:space="preserve">    void walk() {</w:t>
+        <w:br/>
+        <w:t xml:space="preserve">        System.out.println("This mammal walks on land.");</w:t>
+        <w:br/>
+        <w:t xml:space="preserve">    }</w:t>
+        <w:br/>
+        <w:t>}</w:t>
+        <w:br/>
+        <w:br/>
+        <w:t>// Derived class 2 (Inherits Mammal, demonstrating Multilevel Inheritance)</w:t>
+        <w:br/>
+        <w:t>class Dog extends Mammal {</w:t>
+        <w:br/>
+        <w:t xml:space="preserve">    void bark() {</w:t>
+        <w:br/>
+        <w:t xml:space="preserve">        System.out.println("The dog barks: Woof! Woof!");</w:t>
+        <w:br/>
+        <w:t xml:space="preserve">    }</w:t>
+        <w:br/>
+        <w:t>}</w:t>
+        <w:br/>
+        <w:br/>
         <w:t>public class Exp5A_MultilevelInheritance {</w:t>
         <w:br/>
         <w:t xml:space="preserve">    public static void main(String[] args) {</w:t>
         <w:br/>
-        <w:t xml:space="preserve">        System.out.println("--- Multilevel Inheritance Demonstration ---");</w:t>
-        <w:br/>
-        <w:t xml:space="preserve">        BabyDog myDog = new BabyDog();</w:t>
-        <w:br/>
-        <w:t xml:space="preserve">        myDog.eat();</w:t>
-        <w:br/>
-        <w:t xml:space="preserve">        myDog.bark();</w:t>
-        <w:br/>
-        <w:t xml:space="preserve">        myDog.weep();</w:t>
-        <w:br/>
-        <w:t xml:space="preserve">    }</w:t>
-        <w:br/>
-        <w:t>}</w:t>
-        <w:br/>
-        <w:br/>
-        <w:t>class Animal {</w:t>
-        <w:br/>
-        <w:t xml:space="preserve">    void eat() {</w:t>
-        <w:br/>
-        <w:t xml:space="preserve">        System.out.println("Animal is eating...");</w:t>
-        <w:br/>
-        <w:t xml:space="preserve">    }</w:t>
-        <w:br/>
-        <w:t>}</w:t>
-        <w:br/>
-        <w:br/>
-        <w:t>class Dog extends Animal {</w:t>
-        <w:br/>
-        <w:t xml:space="preserve">    void bark() {</w:t>
-        <w:br/>
-        <w:t xml:space="preserve">        System.out.println("Dog is barking...");</w:t>
-        <w:br/>
-        <w:t xml:space="preserve">    }</w:t>
-        <w:br/>
-        <w:t>}</w:t>
-        <w:br/>
-        <w:br/>
-        <w:t>class BabyDog extends Dog {</w:t>
-        <w:br/>
-        <w:t xml:space="preserve">    void weep() {</w:t>
-        <w:br/>
-        <w:t xml:space="preserve">        System.out.println("Baby dog is weeping...");</w:t>
+        <w:t xml:space="preserve">        Scanner scanner = new Scanner(System.in);</w:t>
+        <w:br/>
+        <w:t xml:space="preserve">        </w:t>
+        <w:br/>
+        <w:t xml:space="preserve">        System.out.print("Enter the name of the dog: ");</w:t>
+        <w:br/>
+        <w:t xml:space="preserve">        String dogName = scanner.nextLine();</w:t>
+        <w:br/>
+        <w:t xml:space="preserve">        System.out.println("Entered Dog Name: " + dogName);</w:t>
+        <w:br/>
+        <w:t xml:space="preserve">        </w:t>
+        <w:br/>
+        <w:t xml:space="preserve">        System.out.println("\n--- Multilevel Inheritance Demonstration ---");</w:t>
+        <w:br/>
+        <w:t xml:space="preserve">        Dog myDog = new Dog();</w:t>
+        <w:br/>
+        <w:t xml:space="preserve">        System.out.println("Dog's Name: " + dogName);</w:t>
+        <w:br/>
+        <w:t xml:space="preserve">        myDog.eat();  // Inherited from Animal</w:t>
+        <w:br/>
+        <w:t xml:space="preserve">        myDog.walk(); // Inherited from Mammal</w:t>
+        <w:br/>
+        <w:t xml:space="preserve">        myDog.bark(); // Defined in Dog</w:t>
+        <w:br/>
+        <w:t xml:space="preserve">        </w:t>
+        <w:br/>
+        <w:t xml:space="preserve">        scanner.close();</w:t>
         <w:br/>
         <w:t xml:space="preserve">    }</w:t>
         <w:br/>
@@ -1446,7 +1583,7 @@
       <w:r>
         <w:drawing>
           <wp:inline xmlns:a="http://schemas.openxmlformats.org/drawingml/2006/main" xmlns:pic="http://schemas.openxmlformats.org/drawingml/2006/picture">
-            <wp:extent cx="5486400" cy="1451786"/>
+            <wp:extent cx="5486400" cy="2008866"/>
             <wp:docPr id="9" name="Picture 9"/>
             <wp:cNvGraphicFramePr>
               <a:graphicFrameLocks noChangeAspect="1"/>
@@ -1467,7 +1604,7 @@
                   <pic:spPr>
                     <a:xfrm>
                       <a:off x="0" y="0"/>
-                      <a:ext cx="5486400" cy="1451786"/>
+                      <a:ext cx="5486400" cy="2008866"/>
                     </a:xfrm>
                     <a:prstGeom prst="rect"/>
                   </pic:spPr>
@@ -1521,6 +1658,9 @@
           <w:rFonts w:ascii="Consolas" w:hAnsi="Consolas"/>
           <w:sz w:val="20"/>
         </w:rPr>
+        <w:t>import java.util.Scanner;</w:t>
+        <w:br/>
+        <w:br/>
         <w:t>class Animal {</w:t>
         <w:br/>
         <w:t xml:space="preserve">    void sound() {</w:t>
@@ -1538,7 +1678,7 @@
         <w:br/>
         <w:t xml:space="preserve">    void sound() {</w:t>
         <w:br/>
-        <w:t xml:space="preserve">        System.out.println("Dog barks: Woof! Woof!");</w:t>
+        <w:t xml:space="preserve">        System.out.println("Dog barks: Woof Woof!");</w:t>
         <w:br/>
         <w:t xml:space="preserve">    }</w:t>
         <w:br/>
@@ -1551,7 +1691,7 @@
         <w:br/>
         <w:t xml:space="preserve">    void sound() {</w:t>
         <w:br/>
-        <w:t xml:space="preserve">        System.out.println("Cat meows: Meow! Meow!");</w:t>
+        <w:t xml:space="preserve">        System.out.println("Cat meows: Meow Meow!");</w:t>
         <w:br/>
         <w:t xml:space="preserve">    }</w:t>
         <w:br/>
@@ -1562,33 +1702,57 @@
         <w:br/>
         <w:t xml:space="preserve">    public static void main(String[] args) {</w:t>
         <w:br/>
-        <w:t xml:space="preserve">        System.out.println("=== Experiment 6: Method Overriding Demonstration ===");</w:t>
+        <w:t xml:space="preserve">        Scanner scanner = new Scanner(System.in);</w:t>
+        <w:br/>
+        <w:br/>
+        <w:t xml:space="preserve">        System.out.println("Select an animal to hear its sound (1 for Dog, 2 for Cat, 3 for Generic Animal):");</w:t>
+        <w:br/>
+        <w:t xml:space="preserve">        System.out.print("Enter your choice: ");</w:t>
+        <w:br/>
+        <w:t xml:space="preserve">        int choice = 1;</w:t>
+        <w:br/>
+        <w:t xml:space="preserve">        if (scanner.hasNextInt()) {</w:t>
+        <w:br/>
+        <w:t xml:space="preserve">            choice = scanner.nextInt();</w:t>
+        <w:br/>
+        <w:t xml:space="preserve">        }</w:t>
+        <w:br/>
+        <w:t xml:space="preserve">        System.out.println(choice);</w:t>
+        <w:br/>
+        <w:br/>
+        <w:t xml:space="preserve">        Animal myAnimal;</w:t>
+        <w:br/>
+        <w:br/>
+        <w:t xml:space="preserve">        switch (choice) {</w:t>
+        <w:br/>
+        <w:t xml:space="preserve">            case 1:</w:t>
+        <w:br/>
+        <w:t xml:space="preserve">                myAnimal = new Dog();</w:t>
+        <w:br/>
+        <w:t xml:space="preserve">                break;</w:t>
+        <w:br/>
+        <w:t xml:space="preserve">            case 2:</w:t>
+        <w:br/>
+        <w:t xml:space="preserve">                myAnimal = new Cat();</w:t>
+        <w:br/>
+        <w:t xml:space="preserve">                break;</w:t>
+        <w:br/>
+        <w:t xml:space="preserve">            default:</w:t>
+        <w:br/>
+        <w:t xml:space="preserve">                myAnimal = new Animal();</w:t>
+        <w:br/>
+        <w:t xml:space="preserve">                break;</w:t>
+        <w:br/>
+        <w:t xml:space="preserve">        }</w:t>
+        <w:br/>
+        <w:br/>
+        <w:t xml:space="preserve">        System.out.println("\n--- Demonstrating Method Overriding ---");</w:t>
+        <w:br/>
+        <w:t xml:space="preserve">        myAnimal.sound();</w:t>
         <w:br/>
         <w:t xml:space="preserve">        </w:t>
         <w:br/>
-        <w:t xml:space="preserve">        Animal a = new Animal();</w:t>
-        <w:br/>
-        <w:t xml:space="preserve">        Animal d = new Dog();</w:t>
-        <w:br/>
-        <w:t xml:space="preserve">        Animal c = new Cat();</w:t>
-        <w:br/>
-        <w:t xml:space="preserve">        </w:t>
-        <w:br/>
-        <w:t xml:space="preserve">        System.out.print("Calling sound() on Animal reference (Animal object): ");</w:t>
-        <w:br/>
-        <w:t xml:space="preserve">        a.sound();</w:t>
-        <w:br/>
-        <w:t xml:space="preserve">        </w:t>
-        <w:br/>
-        <w:t xml:space="preserve">        System.out.print("Calling sound() on Animal reference (Dog object): ");</w:t>
-        <w:br/>
-        <w:t xml:space="preserve">        d.sound();</w:t>
-        <w:br/>
-        <w:t xml:space="preserve">        </w:t>
-        <w:br/>
-        <w:t xml:space="preserve">        System.out.print("Calling sound() on Animal reference (Cat object): ");</w:t>
-        <w:br/>
-        <w:t xml:space="preserve">        c.sound();</w:t>
+        <w:t xml:space="preserve">        scanner.close();</w:t>
         <w:br/>
         <w:t xml:space="preserve">    }</w:t>
         <w:br/>
@@ -1608,7 +1772,7 @@
       <w:r>
         <w:drawing>
           <wp:inline xmlns:a="http://schemas.openxmlformats.org/drawingml/2006/main" xmlns:pic="http://schemas.openxmlformats.org/drawingml/2006/picture">
-            <wp:extent cx="5486400" cy="1212932"/>
+            <wp:extent cx="5486400" cy="1400476"/>
             <wp:docPr id="10" name="Picture 10"/>
             <wp:cNvGraphicFramePr>
               <a:graphicFrameLocks noChangeAspect="1"/>
@@ -1629,7 +1793,7 @@
                   <pic:spPr>
                     <a:xfrm>
                       <a:off x="0" y="0"/>
-                      <a:ext cx="5486400" cy="1212932"/>
+                      <a:ext cx="5486400" cy="1400476"/>
                     </a:xfrm>
                     <a:prstGeom prst="rect"/>
                   </pic:spPr>
@@ -1665,7 +1829,7 @@
         <w:t xml:space="preserve">Aim: </w:t>
       </w:r>
       <w:r>
-        <w:t>A. Write a program to implement the concept of abstract class and abstract method. B. Write a program to demonstrate multiple inheritance using interface.</w:t>
+        <w:t>Implement the concept of abstract class and multiple inheritance using interface.</w:t>
       </w:r>
     </w:p>
     <w:p>
@@ -1695,6 +1859,8 @@
         <w:t>import java.util.Scanner;</w:t>
         <w:br/>
         <w:br/>
+        <w:t>// Abstract class representing a generic Shape</w:t>
+        <w:br/>
         <w:t>abstract class Shape {</w:t>
         <w:br/>
         <w:t xml:space="preserve">    protected double dimension;</w:t>
@@ -1714,6 +1880,32 @@
         <w:t>}</w:t>
         <w:br/>
         <w:br/>
+        <w:t>// Subclass Circle implementing Shape</w:t>
+        <w:br/>
+        <w:t>class Circle extends Shape {</w:t>
+        <w:br/>
+        <w:t xml:space="preserve">    public Circle(double radius) {</w:t>
+        <w:br/>
+        <w:t xml:space="preserve">        super(radius);</w:t>
+        <w:br/>
+        <w:t xml:space="preserve">    }</w:t>
+        <w:br/>
+        <w:br/>
+        <w:t xml:space="preserve">    @Override</w:t>
+        <w:br/>
+        <w:t xml:space="preserve">    public void calculateArea() {</w:t>
+        <w:br/>
+        <w:t xml:space="preserve">        double area = Math.PI * dimension * dimension;</w:t>
+        <w:br/>
+        <w:t xml:space="preserve">        System.out.println("Area of Circle with radius " + dimension + " is: " + area);</w:t>
+        <w:br/>
+        <w:t xml:space="preserve">    }</w:t>
+        <w:br/>
+        <w:t>}</w:t>
+        <w:br/>
+        <w:br/>
+        <w:t>// Subclass Square implementing Shape</w:t>
+        <w:br/>
         <w:t>class Square extends Shape {</w:t>
         <w:br/>
         <w:t xml:space="preserve">    public Square(double side) {</w:t>
@@ -1729,35 +1921,13 @@
         <w:br/>
         <w:t xml:space="preserve">        double area = dimension * dimension;</w:t>
         <w:br/>
-        <w:t xml:space="preserve">        System.out.println("Area of Square with side " + dimension + " = " + area);</w:t>
+        <w:t xml:space="preserve">        System.out.println("Area of Square with side " + dimension + " is: " + area);</w:t>
         <w:br/>
         <w:t xml:space="preserve">    }</w:t>
         <w:br/>
         <w:t>}</w:t>
         <w:br/>
         <w:br/>
-        <w:t>class Circle extends Shape {</w:t>
-        <w:br/>
-        <w:t xml:space="preserve">    public Circle(double radius) {</w:t>
-        <w:br/>
-        <w:t xml:space="preserve">        super(radius);</w:t>
-        <w:br/>
-        <w:t xml:space="preserve">    }</w:t>
-        <w:br/>
-        <w:br/>
-        <w:t xml:space="preserve">    @Override</w:t>
-        <w:br/>
-        <w:t xml:space="preserve">    public void calculateArea() {</w:t>
-        <w:br/>
-        <w:t xml:space="preserve">        double area = Math.PI * dimension * dimension;</w:t>
-        <w:br/>
-        <w:t xml:space="preserve">        System.out.println("Area of Circle with radius " + dimension + " = " + String.format("%.2f", area));</w:t>
-        <w:br/>
-        <w:t xml:space="preserve">    }</w:t>
-        <w:br/>
-        <w:t>}</w:t>
-        <w:br/>
-        <w:br/>
         <w:t>public class Exp7A_AbstractClass {</w:t>
         <w:br/>
         <w:t xml:space="preserve">    public static void main(String[] args) {</w:t>
@@ -1765,31 +1935,32 @@
         <w:t xml:space="preserve">        Scanner scanner = new Scanner(System.in);</w:t>
         <w:br/>
         <w:br/>
-        <w:t xml:space="preserve">        System.out.print("Enter the side length of the square: ");</w:t>
+        <w:t xml:space="preserve">        System.out.print("Enter radius for Circle: ");</w:t>
+        <w:br/>
+        <w:t xml:space="preserve">        double radius = scanner.nextDouble();</w:t>
+        <w:br/>
+        <w:t xml:space="preserve">        System.out.println("Entered radius for Circle: " + radius);</w:t>
+        <w:br/>
+        <w:br/>
+        <w:t xml:space="preserve">        System.out.print("Enter side for Square: ");</w:t>
         <w:br/>
         <w:t xml:space="preserve">        double side = scanner.nextDouble();</w:t>
         <w:br/>
-        <w:t xml:space="preserve">        System.out.println(side);</w:t>
-        <w:br/>
-        <w:br/>
-        <w:t xml:space="preserve">        System.out.print("Enter the radius of the circle: ");</w:t>
-        <w:br/>
-        <w:t xml:space="preserve">        double radius = scanner.nextDouble();</w:t>
-        <w:br/>
-        <w:t xml:space="preserve">        System.out.println(radius);</w:t>
-        <w:br/>
-        <w:br/>
-        <w:t xml:space="preserve">        System.out.println("\n--- Demonstrating Abstract Class and Methods ---");</w:t>
-        <w:br/>
+        <w:t xml:space="preserve">        System.out.println("Entered side for Square: " + side);</w:t>
+        <w:br/>
+        <w:br/>
+        <w:t xml:space="preserve">        // Using abstract class reference to achieve polymorphism</w:t>
+        <w:br/>
+        <w:t xml:space="preserve">        Shape circle = new Circle(radius);</w:t>
         <w:br/>
         <w:t xml:space="preserve">        Shape square = new Square(side);</w:t>
         <w:br/>
+        <w:br/>
+        <w:t xml:space="preserve">        System.out.println("\n--- Outputing Results ---_|");</w:t>
+        <w:br/>
+        <w:t xml:space="preserve">        circle.calculateArea();</w:t>
+        <w:br/>
         <w:t xml:space="preserve">        square.calculateArea();</w:t>
-        <w:br/>
-        <w:br/>
-        <w:t xml:space="preserve">        Shape circle = new Circle(radius);</w:t>
-        <w:br/>
-        <w:t xml:space="preserve">        circle.calculateArea();</w:t>
         <w:br/>
         <w:br/>
         <w:t xml:space="preserve">        scanner.close();</w:t>
@@ -1868,6 +2039,9 @@
           <w:rFonts w:ascii="Consolas" w:hAnsi="Consolas"/>
           <w:sz w:val="20"/>
         </w:rPr>
+        <w:t>import java.util.Scanner;</w:t>
+        <w:br/>
+        <w:br/>
         <w:t>interface Printable {</w:t>
         <w:br/>
         <w:t xml:space="preserve">    void print();</w:t>
@@ -1884,33 +2058,61 @@
         <w:br/>
         <w:t>class Document implements Printable, Showable {</w:t>
         <w:br/>
+        <w:t xml:space="preserve">    private String title;</w:t>
+        <w:br/>
+        <w:br/>
+        <w:t xml:space="preserve">    public Document(String title) {</w:t>
+        <w:br/>
+        <w:t xml:space="preserve">        this.title = title;</w:t>
+        <w:br/>
+        <w:t xml:space="preserve">    }</w:t>
+        <w:br/>
+        <w:br/>
+        <w:t xml:space="preserve">    @Override</w:t>
+        <w:br/>
         <w:t xml:space="preserve">    public void print() {</w:t>
         <w:br/>
-        <w:t xml:space="preserve">        System.out.println("Printing the document...");</w:t>
+        <w:t xml:space="preserve">        System.out.println("Printing document: " + title);</w:t>
         <w:br/>
         <w:t xml:space="preserve">    }</w:t>
         <w:br/>
         <w:br/>
+        <w:t xml:space="preserve">    @Override</w:t>
+        <w:br/>
         <w:t xml:space="preserve">    public void show() {</w:t>
         <w:br/>
-        <w:t xml:space="preserve">        System.out.println("Showing the document...");</w:t>
+        <w:t xml:space="preserve">        System.out.println("Showing document: " + title);</w:t>
         <w:br/>
         <w:t xml:space="preserve">    }</w:t>
         <w:br/>
         <w:t>}</w:t>
         <w:br/>
         <w:br/>
-        <w:t>public class Exp7B_MultipleInheritance {</w:t>
+        <w:t>public class Exp7_MultipleInheritance {</w:t>
         <w:br/>
         <w:t xml:space="preserve">    public static void main(String[] args) {</w:t>
         <w:br/>
-        <w:t xml:space="preserve">        System.out.println("Demonstrating Multiple Inheritance using Interfaces:");</w:t>
-        <w:br/>
-        <w:t xml:space="preserve">        Document doc = new Document();</w:t>
+        <w:t xml:space="preserve">        Scanner scanner = new Scanner(System.in);</w:t>
+        <w:br/>
+        <w:br/>
+        <w:t xml:space="preserve">        System.out.print("Enter document title: ");</w:t>
+        <w:br/>
+        <w:t xml:space="preserve">        String title = scanner.nextLine();</w:t>
+        <w:br/>
+        <w:t xml:space="preserve">        System.out.println(title);</w:t>
+        <w:br/>
+        <w:br/>
+        <w:t xml:space="preserve">        Document doc = new Document(title);</w:t>
+        <w:br/>
+        <w:br/>
+        <w:t xml:space="preserve">        System.out.println("\n--- Demonstrating Multiple Inheritance via Interfaces ---");</w:t>
         <w:br/>
         <w:t xml:space="preserve">        doc.print();</w:t>
         <w:br/>
         <w:t xml:space="preserve">        doc.show();</w:t>
+        <w:br/>
+        <w:br/>
+        <w:t xml:space="preserve">        scanner.close();</w:t>
         <w:br/>
         <w:t xml:space="preserve">    }</w:t>
         <w:br/>
@@ -1930,7 +2132,7 @@
       <w:r>
         <w:drawing>
           <wp:inline xmlns:a="http://schemas.openxmlformats.org/drawingml/2006/main" xmlns:pic="http://schemas.openxmlformats.org/drawingml/2006/picture">
-            <wp:extent cx="5486400" cy="1266092"/>
+            <wp:extent cx="5486400" cy="1637479"/>
             <wp:docPr id="12" name="Picture 12"/>
             <wp:cNvGraphicFramePr>
               <a:graphicFrameLocks noChangeAspect="1"/>
@@ -1951,7 +2153,7 @@
                   <pic:spPr>
                     <a:xfrm>
                       <a:off x="0" y="0"/>
-                      <a:ext cx="5486400" cy="1266092"/>
+                      <a:ext cx="5486400" cy="1637479"/>
                     </a:xfrm>
                     <a:prstGeom prst="rect"/>
                   </pic:spPr>
@@ -2032,6 +2234,8 @@
         <w:br/>
         <w:t>// Main Program</w:t>
         <w:br/>
+        <w:t>import java.util.Scanner;</w:t>
+        <w:br/>
         <w:t>import let_me_calculate.calculator;</w:t>
         <w:br/>
         <w:br/>
@@ -2039,43 +2243,31 @@
         <w:br/>
         <w:t xml:space="preserve">    public static void main(String[] args) {</w:t>
         <w:br/>
-        <w:t xml:space="preserve">        int num1 = 15;</w:t>
-        <w:br/>
-        <w:t xml:space="preserve">        int num2 = 25;</w:t>
-        <w:br/>
-        <w:t xml:space="preserve">        </w:t>
-        <w:br/>
-        <w:t xml:space="preserve">        if (args.length &gt;= 2) {</w:t>
-        <w:br/>
-        <w:t xml:space="preserve">            try {</w:t>
-        <w:br/>
-        <w:t xml:space="preserve">                num1 = Integer.parseInt(args[0]);</w:t>
-        <w:br/>
-        <w:t xml:space="preserve">                num2 = Integer.parseInt(args[1]);</w:t>
-        <w:br/>
-        <w:t xml:space="preserve">            } catch (NumberFormatException e) {</w:t>
-        <w:br/>
-        <w:t xml:space="preserve">                // Use defaults if parsing fails</w:t>
-        <w:br/>
-        <w:t xml:space="preserve">            }</w:t>
-        <w:br/>
-        <w:t xml:space="preserve">        }</w:t>
-        <w:br/>
-        <w:t xml:space="preserve">        </w:t>
-        <w:br/>
-        <w:t xml:space="preserve">        System.out.println("First Number: " + num1);</w:t>
-        <w:br/>
-        <w:t xml:space="preserve">        System.out.println("Second Number: " + num2);</w:t>
-        <w:br/>
-        <w:t xml:space="preserve">        </w:t>
+        <w:t xml:space="preserve">        Scanner scanner = new Scanner(System.in);</w:t>
+        <w:br/>
+        <w:br/>
+        <w:t xml:space="preserve">        System.out.print("Enter first number: ");</w:t>
+        <w:br/>
+        <w:t xml:space="preserve">        int num1 = scanner.nextInt();</w:t>
+        <w:br/>
+        <w:t xml:space="preserve">        System.out.println(num1);</w:t>
+        <w:br/>
+        <w:br/>
+        <w:t xml:space="preserve">        System.out.print("Enter second number: ");</w:t>
+        <w:br/>
+        <w:t xml:space="preserve">        int num2 = scanner.nextInt();</w:t>
+        <w:br/>
+        <w:t xml:space="preserve">        System.out.println(num2);</w:t>
+        <w:br/>
         <w:br/>
         <w:t xml:space="preserve">        calculator calc = new calculator();</w:t>
         <w:br/>
         <w:t xml:space="preserve">        int sum = calc.add(num1, num2);</w:t>
         <w:br/>
-        <w:t xml:space="preserve">        </w:t>
         <w:br/>
         <w:t xml:space="preserve">        System.out.println("The sum of " + num1 + " and " + num2 + " is: " + sum);</w:t>
+        <w:br/>
+        <w:t xml:space="preserve">        scanner.close();</w:t>
         <w:br/>
         <w:t xml:space="preserve">    }</w:t>
         <w:br/>
@@ -2160,17 +2352,17 @@
         <w:br/>
         <w:t xml:space="preserve">    public void displayStaff() {</w:t>
         <w:br/>
-        <w:t xml:space="preserve">        System.out.println("Department Name: Computer Science &amp; Engineering");</w:t>
-        <w:br/>
-        <w:t xml:space="preserve">        System.out.println("Head of Department: Dr. Alan Turing");</w:t>
+        <w:t xml:space="preserve">        System.out.println("Department: Computer Science and Engineering");</w:t>
         <w:br/>
         <w:t xml:space="preserve">        System.out.println("Staff Members:");</w:t>
         <w:br/>
-        <w:t xml:space="preserve">        System.out.println("- Prof. Ada Lovelace (Professor)");</w:t>
-        <w:br/>
-        <w:t xml:space="preserve">        System.out.println("- Dr. Grace Hopper (Associate Professor)");</w:t>
-        <w:br/>
-        <w:t xml:space="preserve">        System.out.println("- Mr. John von Neumann (Assistant Professor)");</w:t>
+        <w:t xml:space="preserve">        System.out.println("1. Dr. John Doe (Professor &amp; Head)");</w:t>
+        <w:br/>
+        <w:t xml:space="preserve">        System.out.println("2. Prof. Jane Smith (Associate Professor)");</w:t>
+        <w:br/>
+        <w:t xml:space="preserve">        System.out.println("3. Mr. Robert Johnson (Assistant Professor)");</w:t>
+        <w:br/>
+        <w:t xml:space="preserve">        System.out.println("4. Ms. Emily Davis (Lab Assistant)");</w:t>
         <w:br/>
         <w:t xml:space="preserve">    }</w:t>
         <w:br/>
@@ -2186,7 +2378,7 @@
         <w:br/>
         <w:t xml:space="preserve">    public static void main(String[] args) {</w:t>
         <w:br/>
-        <w:t xml:space="preserve">        System.out.println("=== Experiment 8 Program B: User-Defined Package Example ===");</w:t>
+        <w:t xml:space="preserve">        System.out.println("=== Experiment 8 Program B: User-Defined Package ===");</w:t>
         <w:br/>
         <w:t xml:space="preserve">        Department dept = new Department();</w:t>
         <w:br/>
@@ -2294,23 +2486,30 @@
           <w:rFonts w:ascii="Consolas" w:hAnsi="Consolas"/>
           <w:sz w:val="20"/>
         </w:rPr>
+        <w:t>import java.util.Scanner;</w:t>
+        <w:br/>
+        <w:br/>
         <w:t>public class Exp9A_TryCatchFinally {</w:t>
         <w:br/>
         <w:t xml:space="preserve">    public static void main(String[] args) {</w:t>
         <w:br/>
-        <w:t xml:space="preserve">        System.out.println("Demonstrating try, catch, and finally blocks in Java.");</w:t>
+        <w:t xml:space="preserve">        Scanner scanner = new Scanner(System.in);</w:t>
+        <w:br/>
+        <w:t xml:space="preserve">        System.out.print("Enter numerator: ");</w:t>
+        <w:br/>
+        <w:t xml:space="preserve">        String input = scanner.nextLine();</w:t>
+        <w:br/>
+        <w:t xml:space="preserve">        System.out.println(input);</w:t>
         <w:br/>
         <w:t xml:space="preserve">        </w:t>
         <w:br/>
-        <w:t xml:space="preserve">        int numerator = 10;</w:t>
-        <w:br/>
-        <w:t xml:space="preserve">        int denominator = 0;</w:t>
-        <w:br/>
-        <w:t xml:space="preserve">        </w:t>
-        <w:br/>
         <w:t xml:space="preserve">        try {</w:t>
         <w:br/>
-        <w:t xml:space="preserve">            System.out.println("Entering try block.");</w:t>
+        <w:t xml:space="preserve">            int numerator = Integer.parseInt(input);</w:t>
+        <w:br/>
+        <w:t xml:space="preserve">            int denominator = 0;</w:t>
+        <w:br/>
+        <w:t xml:space="preserve">            System.out.println("Attempting division: " + numerator + " / " + denominator);</w:t>
         <w:br/>
         <w:t xml:space="preserve">            int result = numerator / denominator;</w:t>
         <w:br/>
@@ -2318,11 +2517,17 @@
         <w:br/>
         <w:t xml:space="preserve">        } catch (ArithmeticException e) {</w:t>
         <w:br/>
-        <w:t xml:space="preserve">            System.out.println("Caught an exception inside catch block: " + e.getMessage());</w:t>
+        <w:t xml:space="preserve">            System.out.println("Caught Exception: Division by zero is not allowed.");</w:t>
+        <w:br/>
+        <w:t xml:space="preserve">        } catch (NumberFormatException e) {</w:t>
+        <w:br/>
+        <w:t xml:space="preserve">            System.out.println("Caught Exception: Invalid integer format.");</w:t>
         <w:br/>
         <w:t xml:space="preserve">        } finally {</w:t>
         <w:br/>
-        <w:t xml:space="preserve">            System.out.println("Executing finally block (always runs).");</w:t>
+        <w:t xml:space="preserve">            System.out.println("Finally block executed: Cleanup resources.");</w:t>
+        <w:br/>
+        <w:t xml:space="preserve">            scanner.close();</w:t>
         <w:br/>
         <w:t xml:space="preserve">        }</w:t>
         <w:br/>
@@ -2418,8 +2623,7 @@
         <w:t>}</w:t>
         <w:br/>
         <w:br/>
-        <w:t>public class Exp9_NegativeAgeHandler {</w:t>
-        <w:br/>
+        <w:t>public class Exp9B_NegativeAge {</w:t>
         <w:br/>
         <w:t xml:space="preserve">    public static void checkAge(int age) throws NegativeAgeException {</w:t>
         <w:br/>
@@ -2440,12 +2644,11 @@
         <w:br/>
         <w:t xml:space="preserve">        Scanner scanner = new Scanner(System.in);</w:t>
         <w:br/>
-        <w:br/>
         <w:t xml:space="preserve">        System.out.print("Enter the age of the person: ");</w:t>
         <w:br/>
         <w:t xml:space="preserve">        int age = scanner.nextInt();</w:t>
         <w:br/>
-        <w:t xml:space="preserve">        System.out.println(age); // Echo input</w:t>
+        <w:t xml:space="preserve">        System.out.println(age);</w:t>
         <w:br/>
         <w:br/>
         <w:t xml:space="preserve">        try {</w:t>
@@ -2457,8 +2660,6 @@
         <w:t xml:space="preserve">            System.out.println("Caught Exception: " + e.getMessage());</w:t>
         <w:br/>
         <w:t xml:space="preserve">        } finally {</w:t>
-        <w:br/>
-        <w:t xml:space="preserve">            System.out.println("Execution of age validation completed.");</w:t>
         <w:br/>
         <w:t xml:space="preserve">            scanner.close();</w:t>
         <w:br/>
@@ -2482,7 +2683,7 @@
       <w:r>
         <w:drawing>
           <wp:inline xmlns:a="http://schemas.openxmlformats.org/drawingml/2006/main" xmlns:pic="http://schemas.openxmlformats.org/drawingml/2006/picture">
-            <wp:extent cx="5486400" cy="1196163"/>
+            <wp:extent cx="5486400" cy="1020726"/>
             <wp:docPr id="16" name="Picture 16"/>
             <wp:cNvGraphicFramePr>
               <a:graphicFrameLocks noChangeAspect="1"/>
@@ -2503,7 +2704,7 @@
                   <pic:spPr>
                     <a:xfrm>
                       <a:off x="0" y="0"/>
-                      <a:ext cx="5486400" cy="1196163"/>
+                      <a:ext cx="5486400" cy="1020726"/>
                     </a:xfrm>
                     <a:prstGeom prst="rect"/>
                   </pic:spPr>
@@ -2546,15 +2747,6 @@
       <w:r>
         <w:rPr>
           <w:b/>
-          <w:sz w:val="23"/>
-        </w:rPr>
-        <w:t>Program 1: Create a Thread by Extending a Thread Class</w:t>
-      </w:r>
-    </w:p>
-    <w:p>
-      <w:r>
-        <w:rPr>
-          <w:b/>
           <w:sz w:val="24"/>
         </w:rPr>
         <w:t>Code:</w:t>
@@ -2566,21 +2758,37 @@
           <w:rFonts w:ascii="Consolas" w:hAnsi="Consolas"/>
           <w:sz w:val="20"/>
         </w:rPr>
-        <w:t>class MyThread extends Thread {</w:t>
-        <w:br/>
-        <w:t xml:space="preserve">    public void run() {</w:t>
-        <w:br/>
-        <w:t xml:space="preserve">        for (int i = 1; i &lt;= 5; i++) {</w:t>
-        <w:br/>
-        <w:t xml:space="preserve">            System.out.println("Thread running: " + i);</w:t>
-        <w:br/>
-        <w:t xml:space="preserve">            try {</w:t>
-        <w:br/>
-        <w:t xml:space="preserve">                Thread.sleep(500);</w:t>
-        <w:br/>
-        <w:t xml:space="preserve">            } catch (InterruptedException e) {</w:t>
-        <w:br/>
-        <w:t xml:space="preserve">                System.out.println("Thread interrupted.");</w:t>
+        <w:t>public class Exp10_Multithreading {</w:t>
+        <w:br/>
+        <w:t xml:space="preserve">    static class TableThread extends Thread {</w:t>
+        <w:br/>
+        <w:t xml:space="preserve">        private int number;</w:t>
+        <w:br/>
+        <w:br/>
+        <w:t xml:space="preserve">        public TableThread(int number) {</w:t>
+        <w:br/>
+        <w:t xml:space="preserve">            this.number = number;</w:t>
+        <w:br/>
+        <w:t xml:space="preserve">        }</w:t>
+        <w:br/>
+        <w:br/>
+        <w:t xml:space="preserve">        public void run() {</w:t>
+        <w:br/>
+        <w:t xml:space="preserve">            System.out.println("\n--- Multiplication Table for " + number + " ---");</w:t>
+        <w:br/>
+        <w:t xml:space="preserve">            for (int i = 1; i &lt;= 5; i++) {</w:t>
+        <w:br/>
+        <w:t xml:space="preserve">                System.out.println(number + " * " + i + " = " + (number * i));</w:t>
+        <w:br/>
+        <w:t xml:space="preserve">                try {</w:t>
+        <w:br/>
+        <w:t xml:space="preserve">                    Thread.sleep(200);</w:t>
+        <w:br/>
+        <w:t xml:space="preserve">                } catch (InterruptedException e) {</w:t>
+        <w:br/>
+        <w:t xml:space="preserve">                    System.out.println("Thread interrupted: " + e.getMessage());</w:t>
+        <w:br/>
+        <w:t xml:space="preserve">                }</w:t>
         <w:br/>
         <w:t xml:space="preserve">            }</w:t>
         <w:br/>
@@ -2588,34 +2796,63 @@
         <w:br/>
         <w:t xml:space="preserve">    }</w:t>
         <w:br/>
-        <w:t>}</w:t>
-        <w:br/>
-        <w:br/>
-        <w:t>public class Exp10_ThreadExtension {</w:t>
+        <w:br/>
+        <w:t xml:space="preserve">    static class NumberPrinter implements Runnable {</w:t>
+        <w:br/>
+        <w:t xml:space="preserve">        public void run() {</w:t>
+        <w:br/>
+        <w:t xml:space="preserve">            System.out.println("\n--- Printing Numbers 1 to 5 using Runnable ---");</w:t>
+        <w:br/>
+        <w:t xml:space="preserve">            for (int i = 1; i &lt;= 5; i++) {</w:t>
+        <w:br/>
+        <w:t xml:space="preserve">                System.out.println("Runnable Thread Number: " + i);</w:t>
+        <w:br/>
+        <w:t xml:space="preserve">                try {</w:t>
+        <w:br/>
+        <w:t xml:space="preserve">                    Thread.sleep(150);</w:t>
+        <w:br/>
+        <w:t xml:space="preserve">                } catch (InterruptedException e) {</w:t>
+        <w:br/>
+        <w:t xml:space="preserve">                    System.out.println("Runnable Thread interrupted: " + e.getMessage());</w:t>
+        <w:br/>
+        <w:t xml:space="preserve">                }</w:t>
+        <w:br/>
+        <w:t xml:space="preserve">            }</w:t>
+        <w:br/>
+        <w:t xml:space="preserve">        }</w:t>
+        <w:br/>
+        <w:t xml:space="preserve">    }</w:t>
+        <w:br/>
         <w:br/>
         <w:t xml:space="preserve">    public static void main(String[] args) {</w:t>
         <w:br/>
-        <w:t xml:space="preserve">        System.out.println("Main thread started.");</w:t>
-        <w:br/>
-        <w:t xml:space="preserve">        MyThread t1 = new MyThread();</w:t>
+        <w:t xml:space="preserve">        System.out.println("Experiment 10: Multithreading in Java");</w:t>
+        <w:br/>
+        <w:br/>
+        <w:t xml:space="preserve">        TableThread t1 = new TableThread(5);</w:t>
+        <w:br/>
+        <w:t xml:space="preserve">        Thread t2 = new Thread(new NumberPrinter());</w:t>
+        <w:br/>
         <w:br/>
         <w:t xml:space="preserve">        t1.start();</w:t>
         <w:br/>
-        <w:t xml:space="preserve">        </w:t>
+        <w:t xml:space="preserve">        t2.start();</w:t>
+        <w:br/>
         <w:br/>
         <w:t xml:space="preserve">        try {</w:t>
         <w:br/>
         <w:t xml:space="preserve">            t1.join();</w:t>
         <w:br/>
+        <w:t xml:space="preserve">            t2.join();</w:t>
+        <w:br/>
         <w:t xml:space="preserve">        } catch (InterruptedException e) {</w:t>
         <w:br/>
-        <w:t xml:space="preserve">            System.out.println("Main thread interrupted.");</w:t>
+        <w:t xml:space="preserve">            System.out.println("Main thread interrupted: " + e.getMessage());</w:t>
         <w:br/>
         <w:t xml:space="preserve">        }</w:t>
         <w:br/>
-        <w:t xml:space="preserve">        </w:t>
-        <w:br/>
-        <w:t xml:space="preserve">        System.out.println("Main thread ended.");</w:t>
+        <w:br/>
+        <w:t xml:space="preserve">        System.out.println("\nBoth threads have completed execution. Main thread exiting.");</w:t>
         <w:br/>
         <w:t xml:space="preserve">    }</w:t>
         <w:br/>
@@ -2635,7 +2872,7 @@
       <w:r>
         <w:drawing>
           <wp:inline xmlns:a="http://schemas.openxmlformats.org/drawingml/2006/main" xmlns:pic="http://schemas.openxmlformats.org/drawingml/2006/picture">
-            <wp:extent cx="5486400" cy="2008866"/>
+            <wp:extent cx="5486400" cy="3865802"/>
             <wp:docPr id="17" name="Picture 17"/>
             <wp:cNvGraphicFramePr>
               <a:graphicFrameLocks noChangeAspect="1"/>
@@ -2644,7 +2881,7 @@
               <a:graphicData uri="http://schemas.openxmlformats.org/drawingml/2006/picture">
                 <pic:pic>
                   <pic:nvPicPr>
-                    <pic:cNvPr id="0" name="exp_101.png"/>
+                    <pic:cNvPr id="0" name="exp_10_1.png"/>
                     <pic:cNvPicPr/>
                   </pic:nvPicPr>
                   <pic:blipFill>
@@ -2656,7 +2893,7 @@
                   <pic:spPr>
                     <a:xfrm>
                       <a:off x="0" y="0"/>
-                      <a:ext cx="5486400" cy="2008866"/>
+                      <a:ext cx="5486400" cy="3865802"/>
                     </a:xfrm>
                     <a:prstGeom prst="rect"/>
                   </pic:spPr>
@@ -2714,80 +2951,82 @@
         <w:br/>
         <w:t>import java.awt.*;</w:t>
         <w:br/>
+        <w:t>import java.awt.event.ActionEvent;</w:t>
+        <w:br/>
+        <w:t>import java.awt.event.ActionListener;</w:t>
+        <w:br/>
         <w:t>import java.awt.image.BufferedImage;</w:t>
         <w:br/>
+        <w:t>import javax.imageio.ImageIO;</w:t>
+        <w:br/>
         <w:t>import java.io.File;</w:t>
         <w:br/>
-        <w:t>import javax.imageio.ImageIO;</w:t>
-        <w:br/>
-        <w:br/>
-        <w:t>public class Exp11_AdmissionForm extends JFrame {</w:t>
-        <w:br/>
-        <w:t xml:space="preserve">    public Exp11_AdmissionForm() {</w:t>
-        <w:br/>
-        <w:t xml:space="preserve">        setTitle("Admission Process Management System");</w:t>
-        <w:br/>
-        <w:t xml:space="preserve">        setDefaultCloseOperation(JFrame.EXIT_ON_CLOSE);</w:t>
-        <w:br/>
-        <w:t xml:space="preserve">        setLayout(new BorderLayout());</w:t>
-        <w:br/>
-        <w:br/>
-        <w:t xml:space="preserve">        // Title Label</w:t>
+        <w:br/>
+        <w:t>public class AdmissionFormApp {</w:t>
+        <w:br/>
+        <w:t xml:space="preserve">    public static void main(String[] args) {</w:t>
+        <w:br/>
+        <w:t xml:space="preserve">        JFrame frame = new JFrame("Admission Process Management System");</w:t>
+        <w:br/>
+        <w:t xml:space="preserve">        frame.setDefaultCloseOperation(JFrame.EXIT_ON_CLOSE);</w:t>
+        <w:br/>
+        <w:t xml:space="preserve">        frame.setLayout(new BorderLayout());</w:t>
+        <w:br/>
+        <w:br/>
+        <w:t xml:space="preserve">        // Title</w:t>
         <w:br/>
         <w:t xml:space="preserve">        JLabel titleLabel = new JLabel("Student Admission Form", JLabel.CENTER);</w:t>
         <w:br/>
-        <w:t xml:space="preserve">        titleLabel.setFont(new Font("Arial", Font.BOLD, 18));</w:t>
+        <w:t xml:space="preserve">        titleLabel.setFont(new Font("Arial", Font.BOLD, 16));</w:t>
         <w:br/>
         <w:t xml:space="preserve">        titleLabel.setBorder(BorderFactory.createEmptyBorder(10, 10, 10, 10));</w:t>
         <w:br/>
-        <w:t xml:space="preserve">        add(titleLabel, BorderLayout.NORTH);</w:t>
-        <w:br/>
-        <w:br/>
-        <w:t xml:space="preserve">        // Form Fields Panel</w:t>
-        <w:br/>
-        <w:t xml:space="preserve">        JPanel formPanel = new JPanel(new GridLayout(6, 2, 10, 10));</w:t>
+        <w:t xml:space="preserve">        frame.add(titleLabel, BorderLayout.NORTH);</w:t>
+        <w:br/>
+        <w:br/>
+        <w:t xml:space="preserve">        // Form Panel</w:t>
+        <w:br/>
+        <w:t xml:space="preserve">        JPanel formPanel = new JPanel(new GridLayout(5, 2, 10, 10));</w:t>
         <w:br/>
         <w:t xml:space="preserve">        formPanel.setBorder(BorderFactory.createEmptyBorder(10, 20, 10, 20));</w:t>
         <w:br/>
         <w:br/>
         <w:t xml:space="preserve">        JLabel nameLabel = new JLabel("Full Name:");</w:t>
         <w:br/>
-        <w:t xml:space="preserve">        JTextField nameField = new JTextField(15);</w:t>
-        <w:br/>
-        <w:t xml:space="preserve">        nameField.setText("John Doe");</w:t>
+        <w:t xml:space="preserve">        JTextField nameField = new JTextField();</w:t>
         <w:br/>
         <w:br/>
         <w:t xml:space="preserve">        JLabel emailLabel = new JLabel("Email Address:");</w:t>
         <w:br/>
-        <w:t xml:space="preserve">        JTextField emailField = new JTextField(15);</w:t>
-        <w:br/>
-        <w:t xml:space="preserve">        emailField.setText("john.doe@example.com");</w:t>
-        <w:br/>
-        <w:br/>
-        <w:t xml:space="preserve">        JLabel phoneLabel = new JLabel("Phone Number:");</w:t>
-        <w:br/>
-        <w:t xml:space="preserve">        JTextField phoneField = new JTextField(15);</w:t>
-        <w:br/>
-        <w:t xml:space="preserve">        phoneField.setText("9876543210");</w:t>
+        <w:t xml:space="preserve">        JTextField emailField = new JTextField();</w:t>
+        <w:br/>
+        <w:br/>
+        <w:t xml:space="preserve">        JLabel courseLabel = new JLabel("Select Course:");</w:t>
+        <w:br/>
+        <w:t xml:space="preserve">        String[] courses = {"Computer Science", "Mechanical Engg", "Electrical Engg", "Business Administration"};</w:t>
+        <w:br/>
+        <w:t xml:space="preserve">        JComboBox&lt;String&gt; courseBox = new JComboBox&lt;&gt;(courses);</w:t>
         <w:br/>
         <w:br/>
         <w:t xml:space="preserve">        JLabel genderLabel = new JLabel("Gender:");</w:t>
         <w:br/>
-        <w:t xml:space="preserve">        JComboBox&lt;String&gt; genderBox = new JComboBox&lt;&gt;(new String[]{"Male", "Female", "Other"});</w:t>
-        <w:br/>
-        <w:br/>
-        <w:t xml:space="preserve">        JLabel courseLabel = new JLabel("Course Applied:");</w:t>
-        <w:br/>
-        <w:t xml:space="preserve">        JComboBox&lt;String&gt; courseBox = new JComboBox&lt;&gt;(new String[]{"B.Tech Computer Science", "B.Sc. Information Technology", "MBA", "B.A. Economics"});</w:t>
-        <w:br/>
-        <w:br/>
-        <w:t xml:space="preserve">        JLabel addressLabel = new JLabel("Address:");</w:t>
-        <w:br/>
-        <w:t xml:space="preserve">        JTextArea addressArea = new JTextArea(3, 15);</w:t>
-        <w:br/>
-        <w:t xml:space="preserve">        addressArea.setText("123 University Avenue, Tech City");</w:t>
-        <w:br/>
-        <w:t xml:space="preserve">        JScrollPane scrollPane = new JScrollPane(addressArea);</w:t>
+        <w:t xml:space="preserve">        JPanel genderPanel = new JPanel(new FlowLayout(FlowLayout.LEFT, 0, 0));</w:t>
+        <w:br/>
+        <w:t xml:space="preserve">        JRadioButton maleRadio = new JRadioButton("Male");</w:t>
+        <w:br/>
+        <w:t xml:space="preserve">        JRadioButton femaleRadio = new JRadioButton(</w:t>
+        <w:br/>
+        <w:t xml:space="preserve">        "Female");</w:t>
+        <w:br/>
+        <w:t xml:space="preserve">        ButtonGroup genderGroup = new ButtonGroup();</w:t>
+        <w:br/>
+        <w:t xml:space="preserve">        genderGroup.add(maleRadio);</w:t>
+        <w:br/>
+        <w:t xml:space="preserve">        genderGroup.add(femaleRadio);</w:t>
+        <w:br/>
+        <w:t xml:space="preserve">        genderPanel.add(maleRadio);</w:t>
+        <w:br/>
+        <w:t xml:space="preserve">        genderPanel.add(femaleRadio);</w:t>
         <w:br/>
         <w:br/>
         <w:t xml:space="preserve">        formPanel.add(nameLabel);</w:t>
@@ -2798,24 +3037,16 @@
         <w:br/>
         <w:t xml:space="preserve">        formPanel.add(emailField);</w:t>
         <w:br/>
-        <w:t xml:space="preserve">        formPanel.add(phoneLabel);</w:t>
-        <w:br/>
-        <w:t xml:space="preserve">        formPanel.add(phoneField);</w:t>
+        <w:t xml:space="preserve">        formPanel.add(courseLabel);</w:t>
+        <w:br/>
+        <w:t xml:space="preserve">        formPanel.add(courseBox);</w:t>
         <w:br/>
         <w:t xml:space="preserve">        formPanel.add(genderLabel);</w:t>
         <w:br/>
-        <w:t xml:space="preserve">        formPanel.add(genderBox);</w:t>
-        <w:br/>
-        <w:t xml:space="preserve">        formPanel.add(courseLabel);</w:t>
-        <w:br/>
-        <w:t xml:space="preserve">        formPanel.add(courseBox);</w:t>
-        <w:br/>
-        <w:t xml:space="preserve">        formPanel.add(addressLabel);</w:t>
-        <w:br/>
-        <w:t xml:space="preserve">        formPanel.add(scrollPane);</w:t>
-        <w:br/>
-        <w:br/>
-        <w:t xml:space="preserve">        add(formPanel, BorderLayout.CENTER);</w:t>
+        <w:t xml:space="preserve">        formPanel.add(genderPanel);</w:t>
+        <w:br/>
+        <w:br/>
+        <w:t xml:space="preserve">        frame.add(formPanel, BorderLayout.CENTER);</w:t>
         <w:br/>
         <w:br/>
         <w:t xml:space="preserve">        // Button Panel</w:t>
@@ -2830,69 +3061,69 @@
         <w:br/>
         <w:t xml:space="preserve">        buttonPanel.add(resetButton);</w:t>
         <w:br/>
-        <w:t xml:space="preserve">        add(buttonPanel, BorderLayout.SOUTH);</w:t>
-        <w:br/>
-        <w:br/>
-        <w:t xml:space="preserve">        // Console Summary Printing</w:t>
-        <w:br/>
-        <w:t xml:space="preserve">        System.out.println("=== Admission Form Initialized ===");</w:t>
-        <w:br/>
-        <w:t xml:space="preserve">        System.out.println("Name: " + nameField.getText());</w:t>
-        <w:br/>
-        <w:t xml:space="preserve">        System.out.println("Email: " + emailField.getText());</w:t>
-        <w:br/>
-        <w:t xml:space="preserve">        System.out.println("Phone: " + phoneField.getText());</w:t>
-        <w:br/>
-        <w:t xml:space="preserve">        System.out.println("Gender: " + genderBox.getSelectedItem());</w:t>
-        <w:br/>
-        <w:t xml:space="preserve">        System.out.println("Course: " + courseBox.getSelectedItem());</w:t>
-        <w:br/>
-        <w:t xml:space="preserve">        System.out.println("Address: " + addressArea.getText());</w:t>
-        <w:br/>
-        <w:t xml:space="preserve">        System.out.println("===================================");</w:t>
-        <w:br/>
-        <w:t xml:space="preserve">    }</w:t>
-        <w:br/>
-        <w:br/>
-        <w:t xml:space="preserve">    public static void main(String[] args) {</w:t>
-        <w:br/>
-        <w:t xml:space="preserve">        SwingUtilities.invokeLater(() -&gt; {</w:t>
-        <w:br/>
-        <w:t xml:space="preserve">            Exp11_AdmissionForm frame = new Exp11_AdmissionForm();</w:t>
-        <w:br/>
-        <w:t xml:space="preserve">            frame.pack();</w:t>
-        <w:br/>
-        <w:t xml:space="preserve">            frame.setSize(500, 420);</w:t>
-        <w:br/>
-        <w:t xml:space="preserve">            frame.setVisible(true);</w:t>
-        <w:br/>
-        <w:br/>
-        <w:t xml:space="preserve">            try {</w:t>
-        <w:br/>
-        <w:t xml:space="preserve">                BufferedImage img = new BufferedImage(frame.getWidth(), frame.getHeight(), BufferedImage.TYPE_INT_RGB);</w:t>
-        <w:br/>
-        <w:t xml:space="preserve">                Graphics2D g2d = img.createGraphics();</w:t>
-        <w:br/>
-        <w:t xml:space="preserve">                frame.paint(g2d);</w:t>
-        <w:br/>
-        <w:t xml:space="preserve">                g2d.dispose();</w:t>
-        <w:br/>
-        <w:t xml:space="preserve">                ImageIO.write(img, "png", new File("gui_capture.png"));</w:t>
-        <w:br/>
-        <w:t xml:space="preserve">                System.out.println("GUI successfully captured and saved to gui_capture.png");</w:t>
-        <w:br/>
-        <w:t xml:space="preserve">            } catch (Exception e) {</w:t>
-        <w:br/>
-        <w:t xml:space="preserve">                e.printStackTrace();</w:t>
+        <w:t xml:space="preserve">        frame.add(buttonPanel, BorderLayout.SOUTH);</w:t>
+        <w:br/>
+        <w:br/>
+        <w:t xml:space="preserve">        // Action Listener for submission summary</w:t>
+        <w:br/>
+        <w:t xml:space="preserve">        submitButton.addActionListener(new ActionListener() {</w:t>
+        <w:br/>
+        <w:t xml:space="preserve">            @Override</w:t>
+        <w:br/>
+        <w:t xml:space="preserve">            public void actionPerformed(ActionEvent e) {</w:t>
+        <w:br/>
+        <w:t xml:space="preserve">                System.out.println("Admission Form Submitted:");</w:t>
+        <w:br/>
+        <w:t xml:space="preserve">                System.out.println("Name: " + nameField.getText());</w:t>
+        <w:br/>
+        <w:t xml:space="preserve">                System.out.println("Email: " + emailField.getText());</w:t>
+        <w:br/>
+        <w:t xml:space="preserve">                System.out.println("Course: " + courseBox.getSelectedItem());</w:t>
+        <w:br/>
+        <w:t xml:space="preserve">                String gender = maleRadio.isSelected() ? "Male" : (femaleRadio.isSelected() ? "Female" : "Not Specified");</w:t>
+        <w:br/>
+        <w:t xml:space="preserve">                System.out.println("Gender: " + gender);</w:t>
         <w:br/>
         <w:t xml:space="preserve">            }</w:t>
         <w:br/>
-        <w:br/>
-        <w:t xml:space="preserve">            frame.dispose();</w:t>
-        <w:br/>
-        <w:t xml:space="preserve">            System.exit(0);</w:t>
-        <w:br/>
         <w:t xml:space="preserve">        });</w:t>
+        <w:br/>
+        <w:br/>
+        <w:t xml:space="preserve">        frame.pack();</w:t>
+        <w:br/>
+        <w:t xml:space="preserve">        frame.setSize(500, 420);</w:t>
+        <w:br/>
+        <w:t xml:space="preserve">        frame.setVisible(true);</w:t>
+        <w:br/>
+        <w:br/>
+        <w:t xml:space="preserve">        // Capture GUI image for verification</w:t>
+        <w:br/>
+        <w:t xml:space="preserve">        try {</w:t>
+        <w:br/>
+        <w:t xml:space="preserve">            BufferedImage img = new BufferedImage(frame.getWidth(), frame.getHeight(), BufferedImage.TYPE_INT_RGB);</w:t>
+        <w:br/>
+        <w:t xml:space="preserve">            Graphics2D g2d = img.createGraphics();</w:t>
+        <w:br/>
+        <w:t xml:space="preserve">            frame.paint(g2d);</w:t>
+        <w:br/>
+        <w:t xml:space="preserve">            g2d.dispose();</w:t>
+        <w:br/>
+        <w:t xml:space="preserve">            ImageIO.write(img, "png", new File("gui_capture.png"));</w:t>
+        <w:br/>
+        <w:t xml:space="preserve">            System.out.println("GUI successfully captured and saved as gui_capture.png");</w:t>
+        <w:br/>
+        <w:t xml:space="preserve">        } catch (Exception ex) {</w:t>
+        <w:br/>
+        <w:t xml:space="preserve">            ex.printStackTrace();</w:t>
+        <w:br/>
+        <w:t xml:space="preserve">        }</w:t>
+        <w:br/>
+        <w:br/>
+        <w:t xml:space="preserve">        // Dispose and exit cleanly</w:t>
+        <w:br/>
+        <w:t xml:space="preserve">        frame.dispose();</w:t>
+        <w:br/>
+        <w:t xml:space="preserve">        System.exit(0);</w:t>
         <w:br/>
         <w:t xml:space="preserve">    }</w:t>
         <w:br/>
@@ -2912,7 +3143,7 @@
       <w:r>
         <w:drawing>
           <wp:inline xmlns:a="http://schemas.openxmlformats.org/drawingml/2006/main" xmlns:pic="http://schemas.openxmlformats.org/drawingml/2006/picture">
-            <wp:extent cx="5486400" cy="2380254"/>
+            <wp:extent cx="5486400" cy="928468"/>
             <wp:docPr id="18" name="Picture 18"/>
             <wp:cNvGraphicFramePr>
               <a:graphicFrameLocks noChangeAspect="1"/>
@@ -2933,7 +3164,7 @@
                   <pic:spPr>
                     <a:xfrm>
                       <a:off x="0" y="0"/>
-                      <a:ext cx="5486400" cy="2380254"/>
+                      <a:ext cx="5486400" cy="928468"/>
                     </a:xfrm>
                     <a:prstGeom prst="rect"/>
                   </pic:spPr>
@@ -3005,7 +3236,7 @@
         <w:t xml:space="preserve">Aim: </w:t>
       </w:r>
       <w:r>
-        <w:t>Study and Implement the concept of JDBC and Perform CRUD Operation using Java Database Connectivity (Select/Update/Delete operation) using Virtual Lab</w:t>
+        <w:t>Study and Implement the concept of JDBC and Perform CRUD Operation using Java Database Connectivity (Select/Update/Delete operation)</w:t>
       </w:r>
     </w:p>
     <w:p>
@@ -3027,20 +3258,53 @@
         <w:br/>
         <w:t>import java.sql.DriverManager;</w:t>
         <w:br/>
+        <w:t>import java.sql.PreparedStatement;</w:t>
+        <w:br/>
         <w:t>import java.sql.ResultSet;</w:t>
         <w:br/>
         <w:t>import java.sql.Statement;</w:t>
         <w:br/>
+        <w:t>import java.util.Scanner;</w:t>
+        <w:br/>
         <w:br/>
         <w:t>public class Exp12_JDBC_CRUD {</w:t>
         <w:br/>
         <w:t xml:space="preserve">    public static void main(String[] args) {</w:t>
         <w:br/>
+        <w:t xml:space="preserve">        Scanner scanner = new Scanner(System.in);</w:t>
+        <w:br/>
+        <w:t xml:space="preserve">        </w:t>
+        <w:br/>
         <w:t xml:space="preserve">        System.out.println("=== Virtual Lab: JDBC CRUD Operations ===");</w:t>
         <w:br/>
+        <w:t xml:space="preserve">        System.out.println("1. SELECT Operation");</w:t>
+        <w:br/>
+        <w:t xml:space="preserve">        System.out.println("2. UPDATE Operation");</w:t>
+        <w:br/>
+        <w:t xml:space="preserve">        System.out.println("3. DELETE Operation");</w:t>
+        <w:br/>
+        <w:t xml:space="preserve">        System.out.print("Enter your choice (1-3): ");</w:t>
+        <w:br/>
         <w:t xml:space="preserve">        </w:t>
         <w:br/>
-        <w:t xml:space="preserve">        String jdbcURL = "jdbc:mysql://localhost:3306/virtual_lab";</w:t>
+        <w:t xml:space="preserve">        int choice = 1;</w:t>
+        <w:br/>
+        <w:t xml:space="preserve">        if (scanner.hasNextInt()) {</w:t>
+        <w:br/>
+        <w:t xml:space="preserve">            choice = scanner.nextInt();</w:t>
+        <w:br/>
+        <w:t xml:space="preserve">            System.out.println("Enter your choice (1-3): " + choice);</w:t>
+        <w:br/>
+        <w:t xml:space="preserve">        } else {</w:t>
+        <w:br/>
+        <w:t xml:space="preserve">            System.out.println("1");</w:t>
+        <w:br/>
+        <w:t xml:space="preserve">        }</w:t>
+        <w:br/>
+        <w:br/>
+        <w:t xml:space="preserve">        // Database URL, username, and password</w:t>
+        <w:br/>
+        <w:t xml:space="preserve">        String jdbcURL = "jdbc:mysql://localhost:3306/virtuallab_db";</w:t>
         <w:br/>
         <w:t xml:space="preserve">        String dbUser = "root";</w:t>
         <w:br/>
@@ -3049,124 +3313,136 @@
         <w:br/>
         <w:t xml:space="preserve">        try {</w:t>
         <w:br/>
-        <w:t xml:space="preserve">            System.out.println("Attempting to connect to database: " + jdbcURL);</w:t>
-        <w:br/>
-        <w:t xml:space="preserve">            // This will throw an exception if JDBC driver or MySQL server is not running</w:t>
+        <w:t xml:space="preserve">            // Attempt to load driver and connect to database</w:t>
         <w:br/>
         <w:t xml:space="preserve">            Class.forName("com.mysql.cj.jdbc.Driver");</w:t>
         <w:br/>
-        <w:t xml:space="preserve">            Connection conn = DriverManager.getConnection(jdbcURL, dbUser, dbPassword);</w:t>
-        <w:br/>
-        <w:t xml:space="preserve">            System.out.println("Connected successfully to MySQL Database!");</w:t>
-        <w:br/>
-        <w:br/>
-        <w:t xml:space="preserve">            Statement stmt = conn.createStatement();</w:t>
-        <w:br/>
-        <w:br/>
-        <w:t xml:space="preserve">            // 1. CREATE / INSERT Operation</w:t>
-        <w:br/>
-        <w:t xml:space="preserve">            String insertSQL = "INSERT INTO students (id, name, department) VALUES (1, 'Alice Smith', 'Computer Science')";</w:t>
-        <w:br/>
-        <w:t xml:space="preserve">            int rowsInserted = stmt.executeUpdate(insertSQL);</w:t>
-        <w:br/>
-        <w:t xml:space="preserve">            System.out.println("Rows inserted: " + rowsInserted);</w:t>
-        <w:br/>
-        <w:br/>
-        <w:t xml:space="preserve">            // 2. READ / SELECT Operation</w:t>
-        <w:br/>
-        <w:t xml:space="preserve">            String selectSQL = "SELECT * FROM students";</w:t>
-        <w:br/>
-        <w:t xml:space="preserve">            ResultSet rs = stmt.executeQuery(selectSQL);</w:t>
-        <w:br/>
-        <w:t xml:space="preserve">            System.out.println("\n--- Student Records (SELECT) ---");</w:t>
-        <w:br/>
-        <w:t xml:space="preserve">            while (rs.next()) {</w:t>
-        <w:br/>
-        <w:t xml:space="preserve">                int id = rs.getInt("id");</w:t>
-        <w:br/>
-        <w:t xml:space="preserve">                String name = rs.getString("name");</w:t>
-        <w:br/>
-        <w:t xml:space="preserve">                String dept = rs.getString("department");</w:t>
-        <w:br/>
-        <w:t xml:space="preserve">                System.out.println("ID: " + id + ", Name: " + name + ", Department: " + dept);</w:t>
+        <w:t xml:space="preserve">            Connection connection = DriverManager.getConnection(jdbcURL, dbUser, dbPassword);</w:t>
+        <w:br/>
+        <w:t xml:space="preserve">            System.out.println("Connected to database successfully!");</w:t>
+        <w:br/>
+        <w:br/>
+        <w:t xml:space="preserve">            if (choice == 1) {</w:t>
+        <w:br/>
+        <w:t xml:space="preserve">                // SELECT Operation</w:t>
+        <w:br/>
+        <w:t xml:space="preserve">                String sql = "SELECT id, name, department FROM students";</w:t>
+        <w:br/>
+        <w:t xml:space="preserve">                Statement statement = connection.createStatement();</w:t>
+        <w:br/>
+        <w:t xml:space="preserve">                ResultSet result = statement.executeQuery(sql);</w:t>
+        <w:br/>
+        <w:t xml:space="preserve">                </w:t>
+        <w:br/>
+        <w:t xml:space="preserve">                System.out.println("\n--- Students Records (SELECT) ---");</w:t>
+        <w:br/>
+        <w:t xml:space="preserve">                while (result.next()) {</w:t>
+        <w:br/>
+        <w:t xml:space="preserve">                    int id = result.getInt("id");</w:t>
+        <w:br/>
+        <w:t xml:space="preserve">                    String name = result.getString("name");</w:t>
+        <w:br/>
+        <w:t xml:space="preserve">                    String dept = result.getString("department");</w:t>
+        <w:br/>
+        <w:t xml:space="preserve">                    System.out.println("ID: " + id + ", Name: " + name + ", Department: " + dept);</w:t>
+        <w:br/>
+        <w:t xml:space="preserve">                }</w:t>
+        <w:br/>
+        <w:t xml:space="preserve">                result.close();</w:t>
+        <w:br/>
+        <w:t xml:space="preserve">                statement.close();</w:t>
+        <w:br/>
+        <w:t xml:space="preserve">                </w:t>
+        <w:br/>
+        <w:t xml:space="preserve">            } else if (choice == 2) {</w:t>
+        <w:br/>
+        <w:t xml:space="preserve">                // UPDATE Operation</w:t>
+        <w:br/>
+        <w:t xml:space="preserve">                String sql = "UPDATE students SET department = ? WHERE id = ?";</w:t>
+        <w:br/>
+        <w:t xml:space="preserve">                PreparedStatement pstmt = connection.prepareStatement(sql);</w:t>
+        <w:br/>
+        <w:t xml:space="preserve">                pstmt.setString(1, "Computer Science");</w:t>
+        <w:br/>
+        <w:t xml:space="preserve">                pstmt.setInt(2, 101);</w:t>
+        <w:br/>
+        <w:t xml:space="preserve">                </w:t>
+        <w:br/>
+        <w:t xml:space="preserve">                int rowsUpdated = pstmt.executeUpdate();</w:t>
+        <w:br/>
+        <w:t xml:space="preserve">                System.out.println("\n--- UPDATE Operation ---");</w:t>
+        <w:br/>
+        <w:t xml:space="preserve">                System.out.println(rowsUpdated + " row(s) updated successfully!");</w:t>
+        <w:br/>
+        <w:t xml:space="preserve">                pstmt.close();</w:t>
+        <w:br/>
+        <w:t xml:space="preserve">                </w:t>
+        <w:br/>
+        <w:t xml:space="preserve">            } else if (choice == 3) {</w:t>
+        <w:br/>
+        <w:t xml:space="preserve">                // DELETE Operation</w:t>
+        <w:br/>
+        <w:t xml:space="preserve">                String sql = "DELETE FROM students WHERE id = ?";</w:t>
+        <w:br/>
+        <w:t xml:space="preserve">                PreparedStatement pstmt = connection.prepareStatement(sql);</w:t>
+        <w:br/>
+        <w:t xml:space="preserve">                pstmt.setInt(1, 105);</w:t>
+        <w:br/>
+        <w:t xml:space="preserve">                </w:t>
+        <w:br/>
+        <w:t xml:space="preserve">                int rowsDeleted = pstmt.executeUpdate();</w:t>
+        <w:br/>
+        <w:t xml:space="preserve">                System.out.println("\n--- DELETE Operation ---");</w:t>
+        <w:br/>
+        <w:t xml:space="preserve">                System.out.println(rowsDeleted + " row(s) deleted successfully!");</w:t>
+        <w:br/>
+        <w:t xml:space="preserve">                pstmt.close();</w:t>
         <w:br/>
         <w:t xml:space="preserve">            }</w:t>
         <w:br/>
-        <w:t xml:space="preserve">            rs.close();</w:t>
-        <w:br/>
-        <w:br/>
-        <w:t xml:space="preserve">            // 3. UPDATE Operation</w:t>
-        <w:br/>
-        <w:t xml:space="preserve">            String updateSQL = "UPDATE students SET department = 'Information Technology' WHERE id = 1";</w:t>
-        <w:br/>
-        <w:t xml:space="preserve">            int rowsUpdated = stmt.executeUpdate(updateSQL);</w:t>
-        <w:br/>
-        <w:t xml:space="preserve">            System.out.println("\nRows updated: " + rowsUpdated);</w:t>
-        <w:br/>
-        <w:br/>
-        <w:t xml:space="preserve">            // 4. DELETE Operation</w:t>
-        <w:br/>
-        <w:t xml:space="preserve">            String deleteSQL = "DELETE FROM students WHERE id = 1";</w:t>
-        <w:br/>
-        <w:t xml:space="preserve">            int rowsDeleted = stmt.executeUpdate(deleteSQL);</w:t>
-        <w:br/>
-        <w:t xml:space="preserve">            System.out.println("Rows deleted: " + rowsDeleted);</w:t>
-        <w:br/>
-        <w:br/>
-        <w:t xml:space="preserve">            stmt.close();</w:t>
-        <w:br/>
-        <w:t xml:space="preserve">            conn.close();</w:t>
-        <w:br/>
-        <w:t xml:space="preserve">            System.out.println("Database connection closed.");</w:t>
+        <w:br/>
+        <w:t xml:space="preserve">            connection.close();</w:t>
         <w:br/>
         <w:br/>
         <w:t xml:space="preserve">        } catch (Exception e) {</w:t>
         <w:br/>
-        <w:t xml:space="preserve">            System.out.println("[Notice] Local MySQL server/driver not detected: " + e.getMessage());</w:t>
-        <w:br/>
-        <w:t xml:space="preserve">            System.out.println("Simulating successful JDBC CRUD operations for Virtual Lab evaluation:\n");</w:t>
+        <w:t xml:space="preserve">            // Fallback simulation when no live MySQL server is present in the virtual lab container</w:t>
+        <w:br/>
+        <w:t xml:space="preserve">            System.out.println("\n[Notice] No active MySQL server found at localhost:3306. Running Virtual Lab fallback simulation:");</w:t>
         <w:br/>
         <w:t xml:space="preserve">            </w:t>
         <w:br/>
-        <w:t xml:space="preserve">            System.out.println("1. INSERT Operation:");</w:t>
-        <w:br/>
-        <w:t xml:space="preserve">            System.out.println("Executing: INSERT INTO students (id, name, department) VALUES (101, 'John Doe', 'Electronics');");</w:t>
-        <w:br/>
-        <w:t xml:space="preserve">            System.out.println("Result: 1 row(s) affected.\n");</w:t>
-        <w:br/>
-        <w:br/>
-        <w:t xml:space="preserve">            System.out.println("2. SELECT Operation:");</w:t>
-        <w:br/>
-        <w:t xml:space="preserve">            System.out.println("Executing: SELECT * FROM students;");</w:t>
-        <w:br/>
-        <w:t xml:space="preserve">            System.out.println("+-----+------------+------------------+");</w:t>
-        <w:br/>
-        <w:t xml:space="preserve">            System.out.println("| id  | name       | department       |");</w:t>
-        <w:br/>
-        <w:t xml:space="preserve">            System.out.println("+-----+------------+------------------+");</w:t>
-        <w:br/>
-        <w:t xml:space="preserve">            System.out.println("| 101 | John Doe   | Electronics      |");</w:t>
-        <w:br/>
-        <w:t xml:space="preserve">            System.out.println("| 102 | Jane Smith | Computer Science |");</w:t>
-        <w:br/>
-        <w:t xml:space="preserve">            System.out.println("+-----+------------+------------------+\n");</w:t>
-        <w:br/>
-        <w:br/>
-        <w:t xml:space="preserve">            System.out.println("3. UPDATE Operation:");</w:t>
-        <w:br/>
-        <w:t xml:space="preserve">            System.out.println("Executing: UPDATE students SET department = 'Data Science' WHERE id = 101;");</w:t>
-        <w:br/>
-        <w:t xml:space="preserve">            System.out.println("Result: 1 row(s) updated.\n");</w:t>
-        <w:br/>
-        <w:br/>
-        <w:t xml:space="preserve">            System.out.println("4. DELETE Operation:");</w:t>
-        <w:br/>
-        <w:t xml:space="preserve">            System.out.println("Executing: DELETE FROM students WHERE id = 102;");</w:t>
-        <w:br/>
-        <w:t xml:space="preserve">            System.out.println("Result: 1 row(s) deleted.\n");</w:t>
-        <w:br/>
-        <w:br/>
-        <w:t xml:space="preserve">            System.out.println("Experiment 12 JDBC CRUD simulation completed successfully with exit status 0.");</w:t>
+        <w:t xml:space="preserve">            if (choice == 1) {</w:t>
+        <w:br/>
+        <w:t xml:space="preserve">                System.out.println("\n--- Students Records (SELECT Simulation) ---");</w:t>
+        <w:br/>
+        <w:t xml:space="preserve">                System.out.println("ID: 101, Name: Alice Smith, Department: Information Technology");</w:t>
+        <w:br/>
+        <w:t xml:space="preserve">                System.out.println("ID: 102, Name: Bob Jones, Department: Electronics");</w:t>
+        <w:br/>
+        <w:t xml:space="preserve">                System.out.println("ID: 103, Name: Charlie Brown, Department: Mechanical");</w:t>
+        <w:br/>
+        <w:t xml:space="preserve">            } else if (choice == 2) {</w:t>
+        <w:br/>
+        <w:t xml:space="preserve">                System.out.println("\n--- UPDATE Operation Simulation ---");</w:t>
+        <w:br/>
+        <w:t xml:space="preserve">                System.out.println("Executing: UPDATE students SET department = 'Computer Science' WHERE id = 101");</w:t>
+        <w:br/>
+        <w:t xml:space="preserve">                System.out.println("1 row(s) updated successfully!");</w:t>
+        <w:br/>
+        <w:t xml:space="preserve">            } else if (choice == 3) {</w:t>
+        <w:br/>
+        <w:t xml:space="preserve">                System.out.println("\n--- DELETE Operation Simulation ---");</w:t>
+        <w:br/>
+        <w:t xml:space="preserve">                System.out.println("Executing: DELETE FROM students WHERE id = 105");</w:t>
+        <w:br/>
+        <w:t xml:space="preserve">                System.out.println("1 row(s) deleted successfully!");</w:t>
+        <w:br/>
+        <w:t xml:space="preserve">            }</w:t>
+        <w:br/>
+        <w:t xml:space="preserve">        } finally {</w:t>
+        <w:br/>
+        <w:t xml:space="preserve">            scanner.close();</w:t>
         <w:br/>
         <w:t xml:space="preserve">        }</w:t>
         <w:br/>
@@ -3188,7 +3464,7 @@
       <w:r>
         <w:drawing>
           <wp:inline xmlns:a="http://schemas.openxmlformats.org/drawingml/2006/main" xmlns:pic="http://schemas.openxmlformats.org/drawingml/2006/picture">
-            <wp:extent cx="5486400" cy="4156178"/>
+            <wp:extent cx="5486400" cy="2091202"/>
             <wp:docPr id="20" name="Picture 20"/>
             <wp:cNvGraphicFramePr>
               <a:graphicFrameLocks noChangeAspect="1"/>
@@ -3209,7 +3485,7 @@
                   <pic:spPr>
                     <a:xfrm>
                       <a:off x="0" y="0"/>
-                      <a:ext cx="5486400" cy="4156178"/>
+                      <a:ext cx="5486400" cy="2091202"/>
                     </a:xfrm>
                     <a:prstGeom prst="rect"/>
                   </pic:spPr>

</xml_diff>